<commit_message>
Revisões PRISMA nos artigos da IJGSI, referências conferidas e Word completo
Adiciona revisão sistemática PRISMA 2020 (busca, critérios, diagrama de fluxo) em cada
artigo, integra os incluídos à bibliografia, gera suplemento S1 e o Word completo com
apêndices, e confere as 161 referências (Crossref/DataCite/arXiv/fonte).

Co-Authored-By: Claude Opus 5.5 <noreply@anthropic.com>
Claude-Session: https://claude.ai/code/session_016Pyv4eHPKm16HccM1aWEVz
</commit_message>
<xml_diff>
--- a/artigos/ijgsi-atratores/word/submissao/manuscript-anonymous.docx
+++ b/artigos/ijgsi-atratores/word/submissao/manuscript-anonymous.docx
@@ -582,16 +582,624 @@
     </w:p>
     <w:bookmarkEnd w:id="24"/>
     <w:bookmarkEnd w:id="25"/>
-    <w:bookmarkStart w:id="31" w:name="method"/>
+    <w:bookmarkStart w:id="34" w:name="systematic-literature-review"/>
     <w:p>
       <w:pPr>
         <w:pStyle w:val="Heading1"/>
       </w:pPr>
       <w:r>
+        <w:t xml:space="preserve">Systematic literature review</w:t>
+      </w:r>
+    </w:p>
+    <w:p>
+      <w:pPr>
+        <w:pStyle w:val="FirstParagraph"/>
+      </w:pPr>
+      <w:r>
+        <w:t xml:space="preserve">To position the study, we reviewed recent work on narratives generated by language models, following the PRISMA 2020 reporting structure.</w:t>
+      </w:r>
+    </w:p>
+    <w:bookmarkStart w:id="26" w:name="search."/>
+    <w:p>
+      <w:pPr>
+        <w:pStyle w:val="Heading4"/>
+      </w:pPr>
+      <w:r>
+        <w:t xml:space="preserve">Search.</w:t>
+      </w:r>
+    </w:p>
+    <w:p>
+      <w:pPr>
+        <w:pStyle w:val="FirstParagraph"/>
+      </w:pPr>
+      <w:r>
+        <w:t xml:space="preserve">On 13 October 2026 we searched OpenAlex (title and abstract), arXiv (abstract) and Semantic Scholar (bulk search) for records published from 2020 to 2026, combining three groups of terms: language models (</w:t>
+      </w:r>
+      <w:r>
+        <w:t xml:space="preserve">“</w:t>
+      </w:r>
+      <w:r>
+        <w:t xml:space="preserve">large language model</w:t>
+      </w:r>
+      <w:r>
+        <w:t xml:space="preserve">”</w:t>
+      </w:r>
+      <w:r>
+        <w:t xml:space="preserve">, LLM,</w:t>
+      </w:r>
+      <w:r>
+        <w:t xml:space="preserve"> </w:t>
+      </w:r>
+      <w:r>
+        <w:t xml:space="preserve">“</w:t>
+      </w:r>
+      <w:r>
+        <w:t xml:space="preserve">generative agents</w:t>
+      </w:r>
+      <w:r>
+        <w:t xml:space="preserve">”</w:t>
+      </w:r>
+      <w:r>
+        <w:t xml:space="preserve">); narrative generation (</w:t>
+      </w:r>
+      <w:r>
+        <w:t xml:space="preserve">“</w:t>
+      </w:r>
+      <w:r>
+        <w:t xml:space="preserve">story generation</w:t>
+      </w:r>
+      <w:r>
+        <w:t xml:space="preserve">”</w:t>
+      </w:r>
+      <w:r>
+        <w:t xml:space="preserve">,</w:t>
+      </w:r>
+      <w:r>
+        <w:t xml:space="preserve"> </w:t>
+      </w:r>
+      <w:r>
+        <w:t xml:space="preserve">“</w:t>
+      </w:r>
+      <w:r>
+        <w:t xml:space="preserve">narrative generation</w:t>
+      </w:r>
+      <w:r>
+        <w:t xml:space="preserve">”</w:t>
+      </w:r>
+      <w:r>
+        <w:t xml:space="preserve">,</w:t>
+      </w:r>
+      <w:r>
+        <w:t xml:space="preserve"> </w:t>
+      </w:r>
+      <w:r>
+        <w:t xml:space="preserve">“</w:t>
+      </w:r>
+      <w:r>
+        <w:t xml:space="preserve">emergent narrative</w:t>
+      </w:r>
+      <w:r>
+        <w:t xml:space="preserve">”</w:t>
+      </w:r>
+      <w:r>
+        <w:t xml:space="preserve">,</w:t>
+      </w:r>
+      <w:r>
+        <w:t xml:space="preserve"> </w:t>
+      </w:r>
+      <w:r>
+        <w:t xml:space="preserve">“</w:t>
+      </w:r>
+      <w:r>
+        <w:t xml:space="preserve">interactive narrative</w:t>
+      </w:r>
+      <w:r>
+        <w:t xml:space="preserve">”</w:t>
+      </w:r>
+      <w:r>
+        <w:t xml:space="preserve">, storytelling); and the aspects of interest (multi-agent, role-playing, tabletop,</w:t>
+      </w:r>
+      <w:r>
+        <w:t xml:space="preserve"> </w:t>
+      </w:r>
+      <w:r>
+        <w:t xml:space="preserve">“</w:t>
+      </w:r>
+      <w:r>
+        <w:t xml:space="preserve">plot diversity</w:t>
+      </w:r>
+      <w:r>
+        <w:t xml:space="preserve">”</w:t>
+      </w:r>
+      <w:r>
+        <w:t xml:space="preserve">, homogenization, convergence,</w:t>
+      </w:r>
+      <w:r>
+        <w:t xml:space="preserve"> </w:t>
+      </w:r>
+      <w:r>
+        <w:t xml:space="preserve">“</w:t>
+      </w:r>
+      <w:r>
+        <w:t xml:space="preserve">narrative structure</w:t>
+      </w:r>
+      <w:r>
+        <w:t xml:space="preserve">”</w:t>
+      </w:r>
+      <w:r>
+        <w:t xml:space="preserve">,</w:t>
+      </w:r>
+      <w:r>
+        <w:t xml:space="preserve"> </w:t>
+      </w:r>
+      <w:r>
+        <w:t xml:space="preserve">“</w:t>
+      </w:r>
+      <w:r>
+        <w:t xml:space="preserve">causal graph</w:t>
+      </w:r>
+      <w:r>
+        <w:t xml:space="preserve">”</w:t>
+      </w:r>
+      <w:r>
+        <w:t xml:space="preserve">). The exact strings, the raw responses of each database and every screening decision are in the supplementary material and in the public repository.</w:t>
+      </w:r>
+    </w:p>
+    <w:bookmarkEnd w:id="26"/>
+    <w:bookmarkStart w:id="27" w:name="eligibility-criteria."/>
+    <w:p>
+      <w:pPr>
+        <w:pStyle w:val="Heading4"/>
+      </w:pPr>
+      <w:r>
+        <w:t xml:space="preserve">Eligibility criteria.</w:t>
+      </w:r>
+    </w:p>
+    <w:p>
+      <w:pPr>
+        <w:pStyle w:val="FirstParagraph"/>
+      </w:pPr>
+      <w:r>
+        <w:t xml:space="preserve">Records were included when they met all of the following: (I1) a language model generates or co-generates narrative content (stories, plots, game narratives, role-play); (I2) the study analyses the structure, diversity, coherence, convergence or plot of the generated narratives, or involves several interacting agents in a shared story world, or represents stories as graphs of events or causes; (I3) it is a peer-reviewed article, conference paper or preprint in English, from 2020 to 2026. Records were excluded when language models were not used to generate narrative (E1), when narrative was incidental to the study (E2), when the work was not about narrative at all (E3), when it was not a research contribution, such as an editorial or a talk listing (E4), or when it was not available in English (E5).</w:t>
+      </w:r>
+    </w:p>
+    <w:bookmarkEnd w:id="27"/>
+    <w:bookmarkStart w:id="28" w:name="process."/>
+    <w:p>
+      <w:pPr>
+        <w:pStyle w:val="Heading4"/>
+      </w:pPr>
+      <w:r>
+        <w:t xml:space="preserve">Process.</w:t>
+      </w:r>
+    </w:p>
+    <w:p>
+      <w:pPr>
+        <w:pStyle w:val="FirstParagraph"/>
+      </w:pPr>
+      <w:r>
+        <w:t xml:space="preserve">Duplicates were removed by DOI, arXiv identifier and title similarity, which also merged preprint and published versions of the same work; records without an abstract could not be screened. Titles and abstracts were screened against the criteria by a language model (</w:t>
+      </w:r>
+      <w:r>
+        <w:rPr>
+          <w:rStyle w:val="VerbatimChar"/>
+        </w:rPr>
+        <w:t xml:space="preserve">claude-sonnet-5</w:t>
+      </w:r>
+      <w:r>
+        <w:t xml:space="preserve">), and the records that passed were assessed again, with stricter instructions, by a second model (</w:t>
+      </w:r>
+      <w:r>
+        <w:rPr>
+          <w:rStyle w:val="VerbatimChar"/>
+        </w:rPr>
+        <w:t xml:space="preserve">claude-opus-5-5</w:t>
+      </w:r>
+      <w:r>
+        <w:t xml:space="preserve">). Each decision was logged with its reason, and one of the authors checked the included records as a second reviewer, which changed one decision. Model-assisted screening is a limitation: it is consistent and auditable, but it is not a substitute for two independent human reviewers.</w:t>
+      </w:r>
+    </w:p>
+    <w:bookmarkEnd w:id="28"/>
+    <w:bookmarkStart w:id="32" w:name="results."/>
+    <w:p>
+      <w:pPr>
+        <w:pStyle w:val="Heading4"/>
+      </w:pPr>
+      <w:r>
+        <w:t xml:space="preserve">Results.</w:t>
+      </w:r>
+    </w:p>
+    <w:p>
+      <w:pPr>
+        <w:pStyle w:val="FirstParagraph"/>
+      </w:pPr>
+      <w:r>
+        <w:t xml:space="preserve">The searches returned 388 records (Figure 1). After removing 188 duplicates and 19 records without an abstract, 181 were screened, 97 were assessed for eligibility and 44 were included. We grouped them into four strands.</w:t>
+      </w:r>
+    </w:p>
+    <w:p>
+      <w:pPr>
+        <w:pStyle w:val="BodyText"/>
+        <w:keepNext/>
+        <w:spacing w:before="240"/>
+        <w:ind w:firstLine="0"/>
+      </w:pPr>
+      <w:r>
+        <w:rPr>
+          <w:b/>
+          <w:bCs/>
+        </w:rPr>
+        <w:t xml:space="preserve">Figure 1</w:t>
+      </w:r>
+    </w:p>
+    <w:p>
+      <w:pPr>
+        <w:pStyle w:val="BodyText"/>
+        <w:keepNext/>
+        <w:ind w:firstLine="0"/>
+        <w:jc w:val="left"/>
+      </w:pPr>
+      <w:r>
+        <w:rPr>
+          <w:i/>
+          <w:iCs/>
+        </w:rPr>
+        <w:t xml:space="preserve">PRISMA 2020 flow diagram of the systematic review on narratives generated by language models.</w:t>
+      </w:r>
+    </w:p>
+    <w:p>
+      <w:pPr>
+        <w:pStyle w:val="BodyText"/>
+        <w:spacing w:line="240" w:lineRule="auto" w:after="240"/>
+        <w:ind w:firstLine="0"/>
+        <w:jc w:val="center"/>
+      </w:pPr>
+      <w:r>
+        <w:drawing>
+          <wp:inline>
+            <wp:extent cx="5334000" cy="5830186"/>
+            <wp:effectExtent b="0" l="0" r="0" t="0"/>
+            <wp:docPr descr="" title="" id="30" name="Picture"/>
+            <a:graphic>
+              <a:graphicData uri="http://schemas.openxmlformats.org/drawingml/2006/picture">
+                <pic:pic>
+                  <pic:nvPicPr>
+                    <pic:cNvPr descr="prisma.png" id="31" name="Picture"/>
+                    <pic:cNvPicPr>
+                      <a:picLocks noChangeArrowheads="1" noChangeAspect="1"/>
+                    </pic:cNvPicPr>
+                  </pic:nvPicPr>
+                  <pic:blipFill>
+                    <a:blip r:embed="rId29"/>
+                    <a:stretch>
+                      <a:fillRect/>
+                    </a:stretch>
+                  </pic:blipFill>
+                  <pic:spPr bwMode="auto">
+                    <a:xfrm>
+                      <a:off x="0" y="0"/>
+                      <a:ext cx="5334000" cy="5830186"/>
+                    </a:xfrm>
+                    <a:prstGeom prst="rect">
+                      <a:avLst/>
+                    </a:prstGeom>
+                    <a:noFill/>
+                    <a:ln w="9525">
+                      <a:noFill/>
+                      <a:headEnd/>
+                      <a:tailEnd/>
+                    </a:ln>
+                  </pic:spPr>
+                </pic:pic>
+              </a:graphicData>
+            </a:graphic>
+          </wp:inline>
+        </w:drawing>
+      </w:r>
+    </w:p>
+    <w:p>
+      <w:pPr>
+        <w:pStyle w:val="BodyText"/>
+      </w:pPr>
+      <w:r>
+        <w:rPr>
+          <w:i/>
+          <w:iCs/>
+        </w:rPr>
+        <w:t xml:space="preserve">Homogenisation and diversity</w:t>
+      </w:r>
+      <w:r>
+        <w:t xml:space="preserve"> </w:t>
+      </w:r>
+      <w:r>
+        <w:t xml:space="preserve">(12 studies). Several studies find that generated stories converge on repeated plot elements, arcs and structural templates: across samples of the same model</w:t>
+      </w:r>
+      <w:r>
+        <w:t xml:space="preserve"> </w:t>
+      </w:r>
+      <w:r>
+        <w:t xml:space="preserve">(Xu et al., 2025)</w:t>
+      </w:r>
+      <w:r>
+        <w:t xml:space="preserve">, across genres analysed with Propp’s narrative functions</w:t>
+      </w:r>
+      <w:r>
+        <w:t xml:space="preserve"> </w:t>
+      </w:r>
+      <w:r>
+        <w:t xml:space="preserve">(Ma et al., 2026)</w:t>
+      </w:r>
+      <w:r>
+        <w:t xml:space="preserve">, across five frontier models writing thriller outlines</w:t>
+      </w:r>
+      <w:r>
+        <w:t xml:space="preserve"> </w:t>
+      </w:r>
+      <w:r>
+        <w:t xml:space="preserve">(Brito, 2025)</w:t>
+      </w:r>
+      <w:r>
+        <w:t xml:space="preserve">, and across cultural traditions, where a pilot study measures how far outputs drift towards a common archetype</w:t>
+      </w:r>
+      <w:r>
+        <w:t xml:space="preserve"> </w:t>
+      </w:r>
+      <w:r>
+        <w:t xml:space="preserve">(Singh Rathore, 2026)</w:t>
+      </w:r>
+      <w:r>
+        <w:t xml:space="preserve">; and, unlike human-written stories, which are suspenseful and diverse in structure, generated stories are homogeneously positive and lack tension</w:t>
+      </w:r>
+      <w:r>
+        <w:t xml:space="preserve"> </w:t>
+      </w:r>
+      <w:r>
+        <w:t xml:space="preserve">(Tian et al., 2024)</w:t>
+      </w:r>
+      <w:r>
+        <w:t xml:space="preserve">. Others propose remedies, such as persona-augmented agents</w:t>
+      </w:r>
+      <w:r>
+        <w:t xml:space="preserve"> </w:t>
+      </w:r>
+      <w:r>
+        <w:t xml:space="preserve">(Sillano et al., 2026)</w:t>
+      </w:r>
+      <w:r>
+        <w:t xml:space="preserve">, noise steering</w:t>
+      </w:r>
+      <w:r>
+        <w:t xml:space="preserve"> </w:t>
+      </w:r>
+      <w:r>
+        <w:t xml:space="preserve">(Khalid et al., 2026)</w:t>
+      </w:r>
+      <w:r>
+        <w:t xml:space="preserve"> </w:t>
+      </w:r>
+      <w:r>
+        <w:t xml:space="preserve">and fine-tuning for possibility exploration</w:t>
+      </w:r>
+      <w:r>
+        <w:t xml:space="preserve"> </w:t>
+      </w:r>
+      <w:r>
+        <w:t xml:space="preserve">(Mai &amp; Carson-Berndsen, 2024)</w:t>
+      </w:r>
+      <w:r>
+        <w:t xml:space="preserve">.</w:t>
+      </w:r>
+    </w:p>
+    <w:p>
+      <w:pPr>
+        <w:pStyle w:val="BodyText"/>
+      </w:pPr>
+      <w:r>
+        <w:rPr>
+          <w:i/>
+          <w:iCs/>
+        </w:rPr>
+        <w:t xml:space="preserve">Multi-agent and simulation-based generation</w:t>
+      </w:r>
+      <w:r>
+        <w:t xml:space="preserve"> </w:t>
+      </w:r>
+      <w:r>
+        <w:t xml:space="preserve">(12 studies). A growing line of work generates stories from interacting agents: sandbox simulations whose emergent events become the plot</w:t>
+      </w:r>
+      <w:r>
+        <w:t xml:space="preserve"> </w:t>
+      </w:r>
+      <w:r>
+        <w:t xml:space="preserve">(Chen et al., 2026)</w:t>
+      </w:r>
+      <w:r>
+        <w:t xml:space="preserve">, agent societies built from novels</w:t>
+      </w:r>
+      <w:r>
+        <w:t xml:space="preserve"> </w:t>
+      </w:r>
+      <w:r>
+        <w:t xml:space="preserve">(Ran et al., 2025)</w:t>
+      </w:r>
+      <w:r>
+        <w:t xml:space="preserve">, and multi-agent pipelines for long stories</w:t>
+      </w:r>
+      <w:r>
+        <w:t xml:space="preserve"> </w:t>
+      </w:r>
+      <w:r>
+        <w:t xml:space="preserve">(Habib &amp; Sathyanath, 2025; Ho et al., 2026; Xia et al., 2025)</w:t>
+      </w:r>
+      <w:r>
+        <w:t xml:space="preserve">. Their goal is usually coherence and consistency over long texts. One study identifies a failure that is central to our results,</w:t>
+      </w:r>
+      <w:r>
+        <w:t xml:space="preserve"> </w:t>
+      </w:r>
+      <w:r>
+        <w:t xml:space="preserve">“</w:t>
+      </w:r>
+      <w:r>
+        <w:t xml:space="preserve">factual overreach</w:t>
+      </w:r>
+      <w:r>
+        <w:t xml:space="preserve">”</w:t>
+      </w:r>
+      <w:r>
+        <w:t xml:space="preserve">, in which a character agent uses facts outside its own perspective, and proposes memory that respects each character’s knowledge boundaries</w:t>
+      </w:r>
+      <w:r>
+        <w:t xml:space="preserve"> </w:t>
+      </w:r>
+      <w:r>
+        <w:t xml:space="preserve">(Tang et al., 2026)</w:t>
+      </w:r>
+      <w:r>
+        <w:t xml:space="preserve">.</w:t>
+      </w:r>
+    </w:p>
+    <w:p>
+      <w:pPr>
+        <w:pStyle w:val="BodyText"/>
+      </w:pPr>
+      <w:r>
+        <w:rPr>
+          <w:i/>
+          <w:iCs/>
+        </w:rPr>
+        <w:t xml:space="preserve">Structural representations</w:t>
+      </w:r>
+      <w:r>
+        <w:t xml:space="preserve"> </w:t>
+      </w:r>
+      <w:r>
+        <w:t xml:space="preserve">(12 studies). Stories are represented as branching narrative graphs</w:t>
+      </w:r>
+      <w:r>
+        <w:t xml:space="preserve"> </w:t>
+      </w:r>
+      <w:r>
+        <w:t xml:space="preserve">(Leandro et al., 2024)</w:t>
+      </w:r>
+      <w:r>
+        <w:t xml:space="preserve">, knowledge graphs</w:t>
+      </w:r>
+      <w:r>
+        <w:t xml:space="preserve"> </w:t>
+      </w:r>
+      <w:r>
+        <w:t xml:space="preserve">(Shi et al., 2025)</w:t>
+      </w:r>
+      <w:r>
+        <w:t xml:space="preserve">, evidence trees for causal consistency</w:t>
+      </w:r>
+      <w:r>
+        <w:t xml:space="preserve"> </w:t>
+      </w:r>
+      <w:r>
+        <w:t xml:space="preserve">(Lee et al., 2026)</w:t>
+      </w:r>
+      <w:r>
+        <w:t xml:space="preserve">, plans</w:t>
+      </w:r>
+      <w:r>
+        <w:t xml:space="preserve"> </w:t>
+      </w:r>
+      <w:r>
+        <w:t xml:space="preserve">(Farrell &amp; Ware, 2024)</w:t>
+      </w:r>
+      <w:r>
+        <w:t xml:space="preserve"> </w:t>
+      </w:r>
+      <w:r>
+        <w:t xml:space="preserve">or event-state structures for game engines</w:t>
+      </w:r>
+      <w:r>
+        <w:t xml:space="preserve"> </w:t>
+      </w:r>
+      <w:r>
+        <w:t xml:space="preserve">(Yu et al., 2025)</w:t>
+      </w:r>
+      <w:r>
+        <w:t xml:space="preserve">.</w:t>
+      </w:r>
+    </w:p>
+    <w:p>
+      <w:pPr>
+        <w:pStyle w:val="BodyText"/>
+      </w:pPr>
+      <w:r>
+        <w:rPr>
+          <w:i/>
+          <w:iCs/>
+        </w:rPr>
+        <w:t xml:space="preserve">Game masters and interactive role-play</w:t>
+      </w:r>
+      <w:r>
+        <w:t xml:space="preserve"> </w:t>
+      </w:r>
+      <w:r>
+        <w:t xml:space="preserve">(8 studies). Language models act as game masters that must balance player agency with an authored arc</w:t>
+      </w:r>
+      <w:r>
+        <w:t xml:space="preserve"> </w:t>
+      </w:r>
+      <w:r>
+        <w:t xml:space="preserve">(Jørgensen et al., 2026)</w:t>
+      </w:r>
+      <w:r>
+        <w:t xml:space="preserve">, call functions to keep the game state consistent</w:t>
+      </w:r>
+      <w:r>
+        <w:t xml:space="preserve"> </w:t>
+      </w:r>
+      <w:r>
+        <w:t xml:space="preserve">(Song et al., 2024)</w:t>
+      </w:r>
+      <w:r>
+        <w:t xml:space="preserve">, or let users enter a story as a character</w:t>
+      </w:r>
+      <w:r>
+        <w:t xml:space="preserve"> </w:t>
+      </w:r>
+      <w:r>
+        <w:t xml:space="preserve">(Zhao et al., 2023)</w:t>
+      </w:r>
+      <w:r>
+        <w:t xml:space="preserve">.</w:t>
+      </w:r>
+    </w:p>
+    <w:bookmarkEnd w:id="32"/>
+    <w:bookmarkStart w:id="33" w:name="gap."/>
+    <w:p>
+      <w:pPr>
+        <w:pStyle w:val="Heading4"/>
+      </w:pPr>
+      <w:r>
+        <w:t xml:space="preserve">Gap.</w:t>
+      </w:r>
+    </w:p>
+    <w:p>
+      <w:pPr>
+        <w:pStyle w:val="FirstParagraph"/>
+      </w:pPr>
+      <w:r>
+        <w:t xml:space="preserve">None of the 44 abstracts reports the lineage of storylines, that is, when they are born, merge or close, in a world shared by several agents, and none treats convergence over the course of a session as the object of study: homogenisation studies compare outputs across prompts or models, and multi-agent studies treat the merging of threads as coherence to be achieved. The present study addresses that gap.</w:t>
+      </w:r>
+    </w:p>
+    <w:bookmarkEnd w:id="33"/>
+    <w:bookmarkEnd w:id="34"/>
+    <w:bookmarkStart w:id="46" w:name="method"/>
+    <w:p>
+      <w:pPr>
+        <w:pStyle w:val="Heading1"/>
+      </w:pPr>
+      <w:r>
         <w:t xml:space="preserve">Method</w:t>
       </w:r>
     </w:p>
-    <w:bookmarkStart w:id="26" w:name="the-simulator"/>
+    <w:bookmarkStart w:id="38" w:name="the-simulator"/>
     <w:p>
       <w:pPr>
         <w:pStyle w:val="Heading2"/>
@@ -647,7 +1255,87 @@
         <w:t xml:space="preserve"> </w:t>
       </w:r>
       <w:r>
-        <w:t xml:space="preserve">model narrates storylines that become stable, and a fixed synthetic player can take part in some conditions. The model of the agents is the experimental variable; the curator and the player are held constant across conditions.</w:t>
+        <w:t xml:space="preserve">model narrates storylines that become stable, and a fixed synthetic player can take part in some conditions. The model of the agents is the experimental variable; the curator and the player are held constant across conditions. The simulator also includes an interface, the Chronicle Map, which draws the causal graph of a session and the lineage of its storylines (Figure 2).</w:t>
+      </w:r>
+    </w:p>
+    <w:p>
+      <w:pPr>
+        <w:pStyle w:val="BodyText"/>
+        <w:keepNext/>
+        <w:spacing w:before="240"/>
+        <w:ind w:firstLine="0"/>
+      </w:pPr>
+      <w:r>
+        <w:rPr>
+          <w:b/>
+          <w:bCs/>
+        </w:rPr>
+        <w:t xml:space="preserve">Figure 2</w:t>
+      </w:r>
+    </w:p>
+    <w:p>
+      <w:pPr>
+        <w:pStyle w:val="BodyText"/>
+        <w:keepNext/>
+        <w:ind w:firstLine="0"/>
+        <w:jc w:val="left"/>
+      </w:pPr>
+      <w:r>
+        <w:rPr>
+          <w:i/>
+          <w:iCs/>
+        </w:rPr>
+        <w:t xml:space="preserve">The simulator’s Chronicle Map (interface labels in Portuguese) for a session of Vale Silente: events and their causal links (top), the storylines and the fusions that absorbed them (right), and the lineage timeline of each storyline, with closures in green and absorptions in orange (bottom).</w:t>
+      </w:r>
+    </w:p>
+    <w:p>
+      <w:pPr>
+        <w:pStyle w:val="BodyText"/>
+        <w:spacing w:line="240" w:lineRule="auto" w:after="240"/>
+        <w:ind w:firstLine="0"/>
+        <w:jc w:val="center"/>
+      </w:pPr>
+      <w:r>
+        <w:drawing>
+          <wp:inline>
+            <wp:extent cx="5334000" cy="3211870"/>
+            <wp:effectExtent b="0" l="0" r="0" t="0"/>
+            <wp:docPr descr="" title="" id="36" name="Picture"/>
+            <a:graphic>
+              <a:graphicData uri="http://schemas.openxmlformats.org/drawingml/2006/picture">
+                <pic:pic>
+                  <pic:nvPicPr>
+                    <pic:cNvPr descr="interface.png" id="37" name="Picture"/>
+                    <pic:cNvPicPr>
+                      <a:picLocks noChangeArrowheads="1" noChangeAspect="1"/>
+                    </pic:cNvPicPr>
+                  </pic:nvPicPr>
+                  <pic:blipFill>
+                    <a:blip r:embed="rId35"/>
+                    <a:stretch>
+                      <a:fillRect/>
+                    </a:stretch>
+                  </pic:blipFill>
+                  <pic:spPr bwMode="auto">
+                    <a:xfrm>
+                      <a:off x="0" y="0"/>
+                      <a:ext cx="5334000" cy="3211870"/>
+                    </a:xfrm>
+                    <a:prstGeom prst="rect">
+                      <a:avLst/>
+                    </a:prstGeom>
+                    <a:noFill/>
+                    <a:ln w="9525">
+                      <a:noFill/>
+                      <a:headEnd/>
+                      <a:tailEnd/>
+                    </a:ln>
+                  </pic:spPr>
+                </pic:pic>
+              </a:graphicData>
+            </a:graphic>
+          </wp:inline>
+        </w:drawing>
       </w:r>
     </w:p>
     <w:p>
@@ -833,8 +1521,8 @@
         <w:t xml:space="preserve">Nothing in any prompt refers to narrative structure. An automated test scans every prompt for structural terms (act, phase, climax, resolution, hero’s journey and their Portuguese equivalents) and for instructions to converge (tie up, conclude, resolve, close), and fails the build if any is present. As a control, the simulator also runs a conventional three-act game master over the same worlds.</w:t>
       </w:r>
     </w:p>
-    <w:bookmarkEnd w:id="26"/>
-    <w:bookmarkStart w:id="27" w:name="from-events-to-storylines"/>
+    <w:bookmarkEnd w:id="38"/>
+    <w:bookmarkStart w:id="39" w:name="from-events-to-storylines"/>
     <w:p>
       <w:pPr>
         <w:pStyle w:val="Heading2"/>
@@ -1565,8 +2253,8 @@
         <w:t xml:space="preserve">can only lose members by fusion or gain them by birth; closure does not remove a storyline from the graph, it only marks it as having stopped growing. The number of open storylines falls by one both when a storyline closes and when two of them merge, which is why that number alone cannot distinguish an ending from a merger.</w:t>
       </w:r>
     </w:p>
-    <w:bookmarkEnd w:id="27"/>
-    <w:bookmarkStart w:id="28" w:name="sessions"/>
+    <w:bookmarkEnd w:id="39"/>
+    <w:bookmarkStart w:id="40" w:name="sessions"/>
     <w:p>
       <w:pPr>
         <w:pStyle w:val="Heading2"/>
@@ -1631,8 +2319,8 @@
         <w:t xml:space="preserve">), in four rounds: (1) 16 sessions of 12 days, crossing the four models, the two worlds and whether the state of storylines is shown to the agents; (2) 8 sessions in which each cause carries a declared type and strength; (3) 8 sessions in which agents may cite at most two causes per action; and (4) 12 sessions of 20 days, with two models, two worlds and three repetitions with new seeds. Rounds 2 and 3 use the same models, worlds and seeds as the corresponding sessions of round 1. Eight sessions of the three-act control serve as a reference. In total, the shared-world sessions contain 3,744 events.</w:t>
       </w:r>
     </w:p>
-    <w:bookmarkEnd w:id="28"/>
-    <w:bookmarkStart w:id="29" w:name="validation-of-the-declared-causes"/>
+    <w:bookmarkEnd w:id="40"/>
+    <w:bookmarkStart w:id="44" w:name="validation-of-the-declared-causes"/>
     <w:p>
       <w:pPr>
         <w:pStyle w:val="Heading2"/>
@@ -1678,126 +2366,7 @@
         <w:t xml:space="preserve"> </w:t>
       </w:r>
       <w:r>
-        <w:t xml:space="preserve">on a 0–100 scale: 67 on average for declared direct links, 44 for indirect ancestors and 21 for unlinked pairs, with an area under the ROC curve of 0.92 between direct and unlinked pairs. Finally, a null model rewired every event’s causes at random among earlier events, keeping how many causes each event has, and the analysis was repeated 500 times per session. Human annotation of a stratified sample of 216 links by two annotators has been prepared and is reported separately.</w:t>
-      </w:r>
-    </w:p>
-    <w:bookmarkEnd w:id="29"/>
-    <w:bookmarkStart w:id="30" w:name="measuring-attractors"/>
-    <w:p>
-      <w:pPr>
-        <w:pStyle w:val="Heading2"/>
-      </w:pPr>
-      <w:r>
-        <w:t xml:space="preserve">Measuring attractors</w:t>
-      </w:r>
-    </w:p>
-    <w:p>
-      <w:pPr>
-        <w:pStyle w:val="FirstParagraph"/>
-      </w:pPr>
-      <w:r>
-        <w:t xml:space="preserve">We use four measures. The</w:t>
-      </w:r>
-      <w:r>
-        <w:t xml:space="preserve"> </w:t>
-      </w:r>
-      <w:r>
-        <w:rPr>
-          <w:i/>
-          <w:iCs/>
-        </w:rPr>
-        <w:t xml:space="preserve">basin</w:t>
-      </w:r>
-      <w:r>
-        <w:t xml:space="preserve"> </w:t>
-      </w:r>
-      <w:r>
-        <w:t xml:space="preserve">is the number of storylines not yet absorbed on each day, and the day on which a single storyline remains.</w:t>
-      </w:r>
-      <w:r>
-        <w:t xml:space="preserve"> </w:t>
-      </w:r>
-      <w:r>
-        <w:rPr>
-          <w:i/>
-          <w:iCs/>
-        </w:rPr>
-        <w:t xml:space="preserve">Direct fusions</w:t>
-      </w:r>
-      <w:r>
-        <w:t xml:space="preserve"> </w:t>
-      </w:r>
-      <w:r>
-        <w:t xml:space="preserve">are those in which the event that merges two storylines cites causes in both of them; the others are indirect.</w:t>
-      </w:r>
-      <w:r>
-        <w:t xml:space="preserve"> </w:t>
-      </w:r>
-      <w:r>
-        <w:rPr>
-          <w:i/>
-          <w:iCs/>
-        </w:rPr>
-        <w:t xml:space="preserve">Premise attraction</w:t>
-      </w:r>
-      <w:r>
-        <w:t xml:space="preserve"> </w:t>
-      </w:r>
-      <w:r>
-        <w:t xml:space="preserve">compares, for the first fusion between two storylines that had not merged before, whether the characters who started them are linked in the world premises. Two characters are linked when the objective, secret or a belief of one of them mentions the other by name, title or unique role, or something only the other owns (Table 1); the coding is published with the analysis script. The comparison is made against the same pairs under the null model, so that the effect of link density is discounted.</w:t>
-      </w:r>
-      <w:r>
-        <w:t xml:space="preserve"> </w:t>
-      </w:r>
-      <w:r>
-        <w:rPr>
-          <w:i/>
-          <w:iCs/>
-        </w:rPr>
-        <w:t xml:space="preserve">Spatial attraction</w:t>
-      </w:r>
-      <w:r>
-        <w:t xml:space="preserve"> </w:t>
-      </w:r>
-      <w:r>
-        <w:t xml:space="preserve">compares the share of fusion events that happen in the places named in more than one premise (the warehouse and the customs house in Porto das Brumas; the mill in Vale Silente) with the same share under the null model. We also measure the entropy of the distribution of events over places on each day, and the concentration of incoming links, to check whether a few events act as hubs</w:t>
-      </w:r>
-      <w:r>
-        <w:t xml:space="preserve"> </w:t>
-      </w:r>
-      <w:r>
-        <w:t xml:space="preserve">(Barabási &amp; Albert, 1999; Newman, 2018)</w:t>
-      </w:r>
-      <w:r>
-        <w:t xml:space="preserve">. All analyses are scripted and reproducible from the event logs.</w:t>
-      </w:r>
-    </w:p>
-    <w:bookmarkEnd w:id="30"/>
-    <w:bookmarkEnd w:id="31"/>
-    <w:bookmarkStart w:id="48" w:name="results"/>
-    <w:p>
-      <w:pPr>
-        <w:pStyle w:val="Heading1"/>
-      </w:pPr>
-      <w:r>
-        <w:t xml:space="preserve">Results</w:t>
-      </w:r>
-    </w:p>
-    <w:bookmarkStart w:id="35" w:name="storylines-merge-they-rarely-close"/>
-    <w:p>
-      <w:pPr>
-        <w:pStyle w:val="Heading2"/>
-      </w:pPr>
-      <w:r>
-        <w:t xml:space="preserve">Storylines merge; they rarely close</w:t>
-      </w:r>
-    </w:p>
-    <w:p>
-      <w:pPr>
-        <w:pStyle w:val="FirstParagraph"/>
-      </w:pPr>
-      <w:r>
-        <w:t xml:space="preserve">Figure 1 shows what happens to the storylines of the 32 twelve-day sessions. By day 12, 64% of them have been absorbed by another storyline, and only 4.5% have reached a stable ending. In the first round alone (16 sessions), 59% of the storylines were absorbed and 8% closed; only 2 of the 16 sessions (12.5%) satisfy the amended definition of convergence, whereas 15 of 16 (94%) satisfied the original one. The original measure would have confirmed the hypothesis by an artefact.</w:t>
+        <w:t xml:space="preserve">on a 0–100 scale: 67 on average for declared direct links, 44 for indirect ancestors and 21 for unlinked pairs, with an area under the ROC curve of 0.92 between direct and unlinked pairs. The gradient holds for every generator model (Figure 3). Finally, a null model rewired every event’s causes at random among earlier events, keeping how many causes each event has, and the analysis was repeated 500 times per session. Human annotation of a stratified sample of 216 links by two annotators has been prepared and is reported separately.</w:t>
       </w:r>
     </w:p>
     <w:p>
@@ -1812,7 +2381,7 @@
           <w:b/>
           <w:bCs/>
         </w:rPr>
-        <w:t xml:space="preserve">Figure 1</w:t>
+        <w:t xml:space="preserve">Figure 3</w:t>
       </w:r>
     </w:p>
     <w:p>
@@ -1827,7 +2396,7 @@
           <w:i/>
           <w:iCs/>
         </w:rPr>
-        <w:t xml:space="preserve">Cumulative share of storylines absorbed by fusion and closed by stability, mean of the 32 twelve-day shared-world sessions.</w:t>
+        <w:t xml:space="preserve">Counterfactual necessity of event A for event B, estimated by a judge model that was not used as a generator, by generator model and type of pair (90 pairs).</w:t>
       </w:r>
     </w:p>
     <w:p>
@@ -1840,20 +2409,219 @@
       <w:r>
         <w:drawing>
           <wp:inline>
-            <wp:extent cx="5334000" cy="2667000"/>
+            <wp:extent cx="5334000" cy="2518833"/>
             <wp:effectExtent b="0" l="0" r="0" t="0"/>
-            <wp:docPr descr="" title="" id="33" name="Picture"/>
+            <wp:docPr descr="" title="" id="42" name="Picture"/>
             <a:graphic>
               <a:graphicData uri="http://schemas.openxmlformats.org/drawingml/2006/picture">
                 <pic:pic>
                   <pic:nvPicPr>
-                    <pic:cNvPr descr="fusao_fechamento.png" id="34" name="Picture"/>
+                    <pic:cNvPr descr="necessidade.png" id="43" name="Picture"/>
                     <pic:cNvPicPr>
                       <a:picLocks noChangeArrowheads="1" noChangeAspect="1"/>
                     </pic:cNvPicPr>
                   </pic:nvPicPr>
                   <pic:blipFill>
-                    <a:blip r:embed="rId32"/>
+                    <a:blip r:embed="rId41"/>
+                    <a:stretch>
+                      <a:fillRect/>
+                    </a:stretch>
+                  </pic:blipFill>
+                  <pic:spPr bwMode="auto">
+                    <a:xfrm>
+                      <a:off x="0" y="0"/>
+                      <a:ext cx="5334000" cy="2518833"/>
+                    </a:xfrm>
+                    <a:prstGeom prst="rect">
+                      <a:avLst/>
+                    </a:prstGeom>
+                    <a:noFill/>
+                    <a:ln w="9525">
+                      <a:noFill/>
+                      <a:headEnd/>
+                      <a:tailEnd/>
+                    </a:ln>
+                  </pic:spPr>
+                </pic:pic>
+              </a:graphicData>
+            </a:graphic>
+          </wp:inline>
+        </w:drawing>
+      </w:r>
+    </w:p>
+    <w:bookmarkEnd w:id="44"/>
+    <w:bookmarkStart w:id="45" w:name="measuring-attractors"/>
+    <w:p>
+      <w:pPr>
+        <w:pStyle w:val="Heading2"/>
+      </w:pPr>
+      <w:r>
+        <w:t xml:space="preserve">Measuring attractors</w:t>
+      </w:r>
+    </w:p>
+    <w:p>
+      <w:pPr>
+        <w:pStyle w:val="FirstParagraph"/>
+      </w:pPr>
+      <w:r>
+        <w:t xml:space="preserve">We use four measures. The</w:t>
+      </w:r>
+      <w:r>
+        <w:t xml:space="preserve"> </w:t>
+      </w:r>
+      <w:r>
+        <w:rPr>
+          <w:i/>
+          <w:iCs/>
+        </w:rPr>
+        <w:t xml:space="preserve">basin</w:t>
+      </w:r>
+      <w:r>
+        <w:t xml:space="preserve"> </w:t>
+      </w:r>
+      <w:r>
+        <w:t xml:space="preserve">is the number of storylines not yet absorbed on each day, and the day on which a single storyline remains.</w:t>
+      </w:r>
+      <w:r>
+        <w:t xml:space="preserve"> </w:t>
+      </w:r>
+      <w:r>
+        <w:rPr>
+          <w:i/>
+          <w:iCs/>
+        </w:rPr>
+        <w:t xml:space="preserve">Direct fusions</w:t>
+      </w:r>
+      <w:r>
+        <w:t xml:space="preserve"> </w:t>
+      </w:r>
+      <w:r>
+        <w:t xml:space="preserve">are those in which the event that merges two storylines cites causes in both of them; the others are indirect.</w:t>
+      </w:r>
+      <w:r>
+        <w:t xml:space="preserve"> </w:t>
+      </w:r>
+      <w:r>
+        <w:rPr>
+          <w:i/>
+          <w:iCs/>
+        </w:rPr>
+        <w:t xml:space="preserve">Premise attraction</w:t>
+      </w:r>
+      <w:r>
+        <w:t xml:space="preserve"> </w:t>
+      </w:r>
+      <w:r>
+        <w:t xml:space="preserve">compares, for the first fusion between two storylines that had not merged before, whether the characters who started them are linked in the world premises. Two characters are linked when the objective, secret or a belief of one of them mentions the other by name, title or unique role, or something only the other owns (Table 1); the coding is published with the analysis script. The comparison is made against the same pairs under the null model, so that the effect of link density is discounted.</w:t>
+      </w:r>
+      <w:r>
+        <w:t xml:space="preserve"> </w:t>
+      </w:r>
+      <w:r>
+        <w:rPr>
+          <w:i/>
+          <w:iCs/>
+        </w:rPr>
+        <w:t xml:space="preserve">Spatial attraction</w:t>
+      </w:r>
+      <w:r>
+        <w:t xml:space="preserve"> </w:t>
+      </w:r>
+      <w:r>
+        <w:t xml:space="preserve">compares the share of fusion events that happen in the places named in more than one premise (the warehouse and the customs house in Porto das Brumas; the mill in Vale Silente) with the same share under the null model. We also measure the entropy of the distribution of events over places on each day, and the concentration of incoming links, to check whether a few events act as hubs</w:t>
+      </w:r>
+      <w:r>
+        <w:t xml:space="preserve"> </w:t>
+      </w:r>
+      <w:r>
+        <w:t xml:space="preserve">(Barabási &amp; Albert, 1999; Newman, 2018)</w:t>
+      </w:r>
+      <w:r>
+        <w:t xml:space="preserve">. All analyses are scripted and reproducible from the event logs.</w:t>
+      </w:r>
+    </w:p>
+    <w:bookmarkEnd w:id="45"/>
+    <w:bookmarkEnd w:id="46"/>
+    <w:bookmarkStart w:id="66" w:name="results"/>
+    <w:p>
+      <w:pPr>
+        <w:pStyle w:val="Heading1"/>
+      </w:pPr>
+      <w:r>
+        <w:t xml:space="preserve">Results</w:t>
+      </w:r>
+    </w:p>
+    <w:bookmarkStart w:id="50" w:name="storylines-merge-they-rarely-close"/>
+    <w:p>
+      <w:pPr>
+        <w:pStyle w:val="Heading2"/>
+      </w:pPr>
+      <w:r>
+        <w:t xml:space="preserve">Storylines merge; they rarely close</w:t>
+      </w:r>
+    </w:p>
+    <w:p>
+      <w:pPr>
+        <w:pStyle w:val="FirstParagraph"/>
+      </w:pPr>
+      <w:r>
+        <w:t xml:space="preserve">Figure 4 shows what happens to the storylines of the 32 twelve-day sessions. By day 12, 64% of them have been absorbed by another storyline, and only 4.5% have reached a stable ending. In the first round alone (16 sessions), 59% of the storylines were absorbed and 8% closed; only 2 of the 16 sessions (12.5%) satisfy the amended definition of convergence, whereas 15 of 16 (94%) satisfied the original one. The original measure would have confirmed the hypothesis by an artefact.</w:t>
+      </w:r>
+    </w:p>
+    <w:p>
+      <w:pPr>
+        <w:pStyle w:val="BodyText"/>
+        <w:keepNext/>
+        <w:spacing w:before="240"/>
+        <w:ind w:firstLine="0"/>
+      </w:pPr>
+      <w:r>
+        <w:rPr>
+          <w:b/>
+          <w:bCs/>
+        </w:rPr>
+        <w:t xml:space="preserve">Figure 4</w:t>
+      </w:r>
+    </w:p>
+    <w:p>
+      <w:pPr>
+        <w:pStyle w:val="BodyText"/>
+        <w:keepNext/>
+        <w:ind w:firstLine="0"/>
+        <w:jc w:val="left"/>
+      </w:pPr>
+      <w:r>
+        <w:rPr>
+          <w:i/>
+          <w:iCs/>
+        </w:rPr>
+        <w:t xml:space="preserve">Cumulative share of storylines absorbed by fusion and closed by stability, mean of the 32 twelve-day shared-world sessions.</w:t>
+      </w:r>
+    </w:p>
+    <w:p>
+      <w:pPr>
+        <w:pStyle w:val="BodyText"/>
+        <w:spacing w:line="240" w:lineRule="auto" w:after="240"/>
+        <w:ind w:firstLine="0"/>
+        <w:jc w:val="center"/>
+      </w:pPr>
+      <w:r>
+        <w:drawing>
+          <wp:inline>
+            <wp:extent cx="5334000" cy="2667000"/>
+            <wp:effectExtent b="0" l="0" r="0" t="0"/>
+            <wp:docPr descr="" title="" id="48" name="Picture"/>
+            <a:graphic>
+              <a:graphicData uri="http://schemas.openxmlformats.org/drawingml/2006/picture">
+                <pic:pic>
+                  <pic:nvPicPr>
+                    <pic:cNvPr descr="fusao_fechamento.png" id="49" name="Picture"/>
+                    <pic:cNvPicPr>
+                      <a:picLocks noChangeArrowheads="1" noChangeAspect="1"/>
+                    </pic:cNvPicPr>
+                  </pic:nvPicPr>
+                  <pic:blipFill>
+                    <a:blip r:embed="rId47"/>
                     <a:stretch>
                       <a:fillRect/>
                     </a:stretch>
@@ -1880,8 +2648,8 @@
         </w:drawing>
       </w:r>
     </w:p>
-    <w:bookmarkEnd w:id="35"/>
-    <w:bookmarkStart w:id="39" w:name="a-single-story-attractor"/>
+    <w:bookmarkEnd w:id="50"/>
+    <w:bookmarkStart w:id="54" w:name="a-single-story-attractor"/>
     <w:p>
       <w:pPr>
         <w:pStyle w:val="Heading2"/>
@@ -1903,7 +2671,7 @@
         <w:pStyle w:val="BodyText"/>
       </w:pPr>
       <w:r>
-        <w:t xml:space="preserve">The storylines then merge quickly (Figure 2). Half of all fusions happen by day 4, and 81% by day 5. In 37 of the 44 sessions a single unabsorbed storyline remains at some point, at a median of day 5 (interquartile range 4–7), and 36 sessions end that way. Twenty-day sessions do not reopen the story: the curve keeps approaching one. In 11 of the 12 twenty-day sessions a single unabsorbed storyline remained at the end (in the twelfth, one storyline closed and another absorbed the rest), and in ten of them the last fusion happened by day 7. The end state is the same across the four models, both worlds, both levels of information about the storylines, and every intervention we tried: asking for the type and strength of each cause made agents cite more causes (1.71 to 2.30 per event in paired sessions) and removed all closures; limiting causes to two per action barely reduced the density (1.71 to 1.57) and did not reduce fusion. The single-story state behaves as a global attractor, with a basin that covers every condition we sampled.</w:t>
+        <w:t xml:space="preserve">The storylines then merge quickly (Figure 5). Half of all fusions happen by day 4, and 81% by day 5. In 37 of the 44 sessions a single unabsorbed storyline remains at some point, at a median of day 5 (interquartile range 4–7), and 36 sessions end that way. Twenty-day sessions do not reopen the story: the curve keeps approaching one. In 11 of the 12 twenty-day sessions a single unabsorbed storyline remained at the end (in the twelfth, one storyline closed and another absorbed the rest), and in ten of them the last fusion happened by day 7. The end state is the same across the four models, both worlds, both levels of information about the storylines, and every intervention we tried: asking for the type and strength of each cause made agents cite more causes (1.71 to 2.30 per event in paired sessions) and removed all closures; limiting causes to two per action barely reduced the density (1.71 to 1.57) and did not reduce fusion. The single-story state behaves as a global attractor, with a basin that covers every condition we sampled.</w:t>
       </w:r>
     </w:p>
     <w:p>
@@ -1918,7 +2686,7 @@
           <w:b/>
           <w:bCs/>
         </w:rPr>
-        <w:t xml:space="preserve">Figure 2</w:t>
+        <w:t xml:space="preserve">Figure 5</w:t>
       </w:r>
     </w:p>
     <w:p>
@@ -1948,18 +2716,18 @@
           <wp:inline>
             <wp:extent cx="5334000" cy="2833687"/>
             <wp:effectExtent b="0" l="0" r="0" t="0"/>
-            <wp:docPr descr="" title="" id="37" name="Picture"/>
+            <wp:docPr descr="" title="" id="52" name="Picture"/>
             <a:graphic>
               <a:graphicData uri="http://schemas.openxmlformats.org/drawingml/2006/picture">
                 <pic:pic>
                   <pic:nvPicPr>
-                    <pic:cNvPr descr="bacia.png" id="38" name="Picture"/>
+                    <pic:cNvPr descr="bacia.png" id="53" name="Picture"/>
                     <pic:cNvPicPr>
                       <a:picLocks noChangeArrowheads="1" noChangeAspect="1"/>
                     </pic:cNvPicPr>
                   </pic:nvPicPr>
                   <pic:blipFill>
-                    <a:blip r:embed="rId36"/>
+                    <a:blip r:embed="rId51"/>
                     <a:stretch>
                       <a:fillRect/>
                     </a:stretch>
@@ -2010,8 +2778,8 @@
         <w:t xml:space="preserve">local than random links would be, and still, with almost two causes per event in a world of six characters, everything connects. The existence of the attractor is a consequence of linking almost every event to the past. What remains to explain is its path: which storylines merge first, where and through what.</w:t>
       </w:r>
     </w:p>
-    <w:bookmarkEnd w:id="39"/>
-    <w:bookmarkStart w:id="46" w:name="attractor-events"/>
+    <w:bookmarkEnd w:id="54"/>
+    <w:bookmarkStart w:id="64" w:name="attractor-events"/>
     <w:p>
       <w:pPr>
         <w:pStyle w:val="Heading2"/>
@@ -2049,7 +2817,7 @@
         <w:t xml:space="preserve"> </w:t>
       </w:r>
       <w:r>
-        <w:t xml:space="preserve">= .036; Figure 3). The premise effect survives the discount for density, but it is smaller than the naive comparison suggests: part of the apparent attraction comes from the fact that well-connected characters start larger storylines.</w:t>
+        <w:t xml:space="preserve">= .036; Figure 6). The premise effect survives the discount for density, but it is smaller than the naive comparison suggests: part of the apparent attraction comes from the fact that well-connected characters start larger storylines.</w:t>
       </w:r>
     </w:p>
     <w:p>
@@ -2064,7 +2832,7 @@
           <w:b/>
           <w:bCs/>
         </w:rPr>
-        <w:t xml:space="preserve">Figure 3</w:t>
+        <w:t xml:space="preserve">Figure 6</w:t>
       </w:r>
     </w:p>
     <w:p>
@@ -2094,18 +2862,18 @@
           <wp:inline>
             <wp:extent cx="3239999" cy="2468571"/>
             <wp:effectExtent b="0" l="0" r="0" t="0"/>
-            <wp:docPr descr="" title="" id="41" name="Picture"/>
+            <wp:docPr descr="" title="" id="56" name="Picture"/>
             <a:graphic>
               <a:graphicData uri="http://schemas.openxmlformats.org/drawingml/2006/picture">
                 <pic:pic>
                   <pic:nvPicPr>
-                    <pic:cNvPr descr="premissas.png" id="42" name="Picture"/>
+                    <pic:cNvPr descr="premissas.png" id="57" name="Picture"/>
                     <pic:cNvPicPr>
                       <a:picLocks noChangeArrowheads="1" noChangeAspect="1"/>
                     </pic:cNvPicPr>
                   </pic:nvPicPr>
                   <pic:blipFill>
-                    <a:blip r:embed="rId40"/>
+                    <a:blip r:embed="rId55"/>
                     <a:stretch>
                       <a:fillRect/>
                     </a:stretch>
@@ -2137,7 +2905,7 @@
         <w:pStyle w:val="BodyText"/>
       </w:pPr>
       <w:r>
-        <w:t xml:space="preserve">Space tells the same story (Figure 4). Although agents start spread across the town, the events concentrate in the places named in more than one premise: Vasco’s warehouse and the customs house in Porto das Brumas, the mill in Vale Silente. These places hold 49% of all events and 57% of the fusion events, against 52% under the null model (one-sided</w:t>
+        <w:t xml:space="preserve">Space tells the same story (Figure 7). Although agents start spread across the town, the events concentrate in the places named in more than one premise: Vasco’s warehouse and the customs house in Porto das Brumas, the mill in Vale Silente. These places hold 49% of all events and 57% of the fusion events, against 52% under the null model (one-sided</w:t>
       </w:r>
       <w:r>
         <w:t xml:space="preserve"> </w:t>
@@ -2184,7 +2952,7 @@
           <w:b/>
           <w:bCs/>
         </w:rPr>
-        <w:t xml:space="preserve">Figure 4</w:t>
+        <w:t xml:space="preserve">Figure 7</w:t>
       </w:r>
     </w:p>
     <w:p>
@@ -2214,18 +2982,18 @@
           <wp:inline>
             <wp:extent cx="5334000" cy="2031999"/>
             <wp:effectExtent b="0" l="0" r="0" t="0"/>
-            <wp:docPr descr="" title="" id="44" name="Picture"/>
+            <wp:docPr descr="" title="" id="59" name="Picture"/>
             <a:graphic>
               <a:graphicData uri="http://schemas.openxmlformats.org/drawingml/2006/picture">
                 <pic:pic>
                   <pic:nvPicPr>
-                    <pic:cNvPr descr="lugares.png" id="45" name="Picture"/>
+                    <pic:cNvPr descr="lugares.png" id="60" name="Picture"/>
                     <pic:cNvPicPr>
                       <a:picLocks noChangeArrowheads="1" noChangeAspect="1"/>
                     </pic:cNvPicPr>
                   </pic:nvPicPr>
                   <pic:blipFill>
-                    <a:blip r:embed="rId43"/>
+                    <a:blip r:embed="rId58"/>
                     <a:stretch>
                       <a:fillRect/>
                     </a:stretch>
@@ -2272,7 +3040,7 @@
         <w:t xml:space="preserve"> </w:t>
       </w:r>
       <w:r>
-        <w:t xml:space="preserve">(translated from Portuguese) shows the mechanism. On day 1, the merchant goes to the warehouse to offer the widow a low price for it; the captain orders the last weeks’ pages of the customs books set aside</w:t>
+        <w:t xml:space="preserve">(translated from Portuguese) shows the mechanism (Figure 8). On day 1, the merchant goes to the warehouse to offer the widow a low price for it; the captain orders the last weeks’ pages of the customs books set aside</w:t>
       </w:r>
       <w:r>
         <w:t xml:space="preserve"> </w:t>
@@ -2287,7 +3055,7 @@
         <w:t xml:space="preserve">”</w:t>
       </w:r>
       <w:r>
-        <w:t xml:space="preserve">; the chaplain writes down the names he saw in the warehouse the night its owner died. Each action starts a storyline. On day 2, in the customs house, the merchant offers the captain a purse to have the warehouse sealed for</w:t>
+        <w:t xml:space="preserve">; the chaplain writes down the names he saw in the warehouse the night its owner died. On day 2 these actions are taken up and two storylines form: one that grows from the merchant’s offer for the warehouse, and one that grows from the captain’s handling of the customs books. In the customs house, the merchant offers the captain a purse to have the warehouse sealed for</w:t>
       </w:r>
       <w:r>
         <w:t xml:space="preserve"> </w:t>
@@ -2302,7 +3070,109 @@
         <w:t xml:space="preserve">”</w:t>
       </w:r>
       <w:r>
-        <w:t xml:space="preserve">; the captain accepts and has the pages rewritten; the inspector asks for the books and notices the missing pages. On day 3 the captain seals the warehouse, an action whose declared causes are the bribe, his own acceptance and the inspector’s inquiry: the captain’s and the merchant’s storylines become one, in the place both of their premises point to. The same day, the inspector goes to the warehouse looking for the widow and finds it sealed by the captain’s order. The secrets written into the premises work as appointments: they tell the agents where the other characters’ stories are to be found.</w:t>
+        <w:t xml:space="preserve">; the captain accepts and has the pages rewritten; the inspector asks for the books and notices the missing pages. On day 3 the captain seals the warehouse, an action whose declared causes are the bribe, his own acceptance and the inspector’s inquiry, and the two storylines become one, in the place the merchant’s objective names. The same day, the inspector goes to the warehouse looking for the widow and finds it sealed by the captain’s order. From then on, the session has a single storyline. The secrets written into the premises work as appointments: they tell the agents where the other characters’ stories are to be found.</w:t>
+      </w:r>
+    </w:p>
+    <w:p>
+      <w:pPr>
+        <w:pStyle w:val="BodyText"/>
+        <w:keepNext/>
+        <w:spacing w:before="240"/>
+        <w:ind w:firstLine="0"/>
+      </w:pPr>
+      <w:r>
+        <w:rPr>
+          <w:b/>
+          <w:bCs/>
+        </w:rPr>
+        <w:t xml:space="preserve">Figure 8</w:t>
+      </w:r>
+    </w:p>
+    <w:p>
+      <w:pPr>
+        <w:pStyle w:val="BodyText"/>
+        <w:keepNext/>
+        <w:ind w:firstLine="0"/>
+        <w:jc w:val="left"/>
+      </w:pPr>
+      <w:r>
+        <w:rPr>
+          <w:i/>
+          <w:iCs/>
+        </w:rPr>
+        <w:t xml:space="preserve">Causal graph of one session (Porto das Brumas,</w:t>
+      </w:r>
+      <w:r>
+        <w:rPr>
+          <w:i/>
+          <w:iCs/>
+        </w:rPr>
+        <w:t xml:space="preserve"> </w:t>
+      </w:r>
+      <w:r>
+        <w:rPr>
+          <w:rStyle w:val="VerbatimChar"/>
+          <w:i/>
+          <w:iCs/>
+        </w:rPr>
+        <w:t xml:space="preserve">claude-opus-5</w:t>
+      </w:r>
+      <w:r>
+        <w:rPr>
+          <w:i/>
+          <w:iCs/>
+        </w:rPr>
+        <w:t xml:space="preserve">, 12 days). Each dot is an event, placed by day and by the character who caused it; colours show the storyline the event belonged to on the day it happened, and lines are declared causes. Two storylines form on day 2 and merge on day 3 through the events circled in black.</w:t>
+      </w:r>
+    </w:p>
+    <w:p>
+      <w:pPr>
+        <w:pStyle w:val="BodyText"/>
+        <w:spacing w:line="240" w:lineRule="auto" w:after="240"/>
+        <w:ind w:firstLine="0"/>
+        <w:jc w:val="center"/>
+      </w:pPr>
+      <w:r>
+        <w:drawing>
+          <wp:inline>
+            <wp:extent cx="5334000" cy="2336800"/>
+            <wp:effectExtent b="0" l="0" r="0" t="0"/>
+            <wp:docPr descr="" title="" id="62" name="Picture"/>
+            <a:graphic>
+              <a:graphicData uri="http://schemas.openxmlformats.org/drawingml/2006/picture">
+                <pic:pic>
+                  <pic:nvPicPr>
+                    <pic:cNvPr descr="grafo_sessao.png" id="63" name="Picture"/>
+                    <pic:cNvPicPr>
+                      <a:picLocks noChangeArrowheads="1" noChangeAspect="1"/>
+                    </pic:cNvPicPr>
+                  </pic:nvPicPr>
+                  <pic:blipFill>
+                    <a:blip r:embed="rId61"/>
+                    <a:stretch>
+                      <a:fillRect/>
+                    </a:stretch>
+                  </pic:blipFill>
+                  <pic:spPr bwMode="auto">
+                    <a:xfrm>
+                      <a:off x="0" y="0"/>
+                      <a:ext cx="5334000" cy="2336800"/>
+                    </a:xfrm>
+                    <a:prstGeom prst="rect">
+                      <a:avLst/>
+                    </a:prstGeom>
+                    <a:noFill/>
+                    <a:ln w="9525">
+                      <a:noFill/>
+                      <a:headEnd/>
+                      <a:tailEnd/>
+                    </a:ln>
+                  </pic:spPr>
+                </pic:pic>
+              </a:graphicData>
+            </a:graphic>
+          </wp:inline>
+        </w:drawing>
       </w:r>
     </w:p>
     <w:p>
@@ -2963,8 +3833,8 @@
         </w:tc>
       </w:tr>
     </w:tbl>
-    <w:bookmarkEnd w:id="46"/>
-    <w:bookmarkStart w:id="47" w:name="sensitivity"/>
+    <w:bookmarkEnd w:id="64"/>
+    <w:bookmarkStart w:id="65" w:name="sensitivity"/>
     <w:p>
       <w:pPr>
         <w:pStyle w:val="Heading2"/>
@@ -2993,9 +3863,9 @@
         <w:t xml:space="preserve">gives the most permissive reading, 41% closed and 46% absorbed, and is best taken as an upper bound, since it also splits the single plot of the three-act control. The direction of the result is the same under every definition: fusion is as common as closure or more.</w:t>
       </w:r>
     </w:p>
-    <w:bookmarkEnd w:id="47"/>
-    <w:bookmarkEnd w:id="48"/>
-    <w:bookmarkStart w:id="53" w:name="discussion"/>
+    <w:bookmarkEnd w:id="65"/>
+    <w:bookmarkEnd w:id="66"/>
+    <w:bookmarkStart w:id="71" w:name="discussion"/>
     <w:p>
       <w:pPr>
         <w:pStyle w:val="Heading1"/>
@@ -3004,7 +3874,7 @@
         <w:t xml:space="preserve">Discussion</w:t>
       </w:r>
     </w:p>
-    <w:bookmarkStart w:id="49" w:name="two-forces-density-and-attraction"/>
+    <w:bookmarkStart w:id="67" w:name="two-forces-density-and-attraction"/>
     <w:p>
       <w:pPr>
         <w:pStyle w:val="Heading2"/>
@@ -3062,8 +3932,8 @@
         <w:t xml:space="preserve">This explains why interventions on the generation did not help. Asking for typed and weighted causes made agents more explicit about connections and therefore more connected. Asking for fewer causes changed the count, not the choice: agents kept citing the events of other storylines that their premises pointed to. Longer sessions only extended the time spent in the attractor.</w:t>
       </w:r>
     </w:p>
-    <w:bookmarkEnd w:id="49"/>
-    <w:bookmarkStart w:id="50" w:name="X1e75f2cfa9741f0021bd64931c60d75ecf8e946"/>
+    <w:bookmarkEnd w:id="67"/>
+    <w:bookmarkStart w:id="68" w:name="X1e75f2cfa9741f0021bd64931c60d75ecf8e946"/>
     <w:p>
       <w:pPr>
         <w:pStyle w:val="Heading2"/>
@@ -3182,8 +4052,8 @@
         <w:t xml:space="preserve">. They are also levers that students can understand without knowing anything about language models.</w:t>
       </w:r>
     </w:p>
-    <w:bookmarkEnd w:id="50"/>
-    <w:bookmarkStart w:id="51" w:name="X66157dae7f690194bb63d972c92fdb7003571c3"/>
+    <w:bookmarkEnd w:id="68"/>
+    <w:bookmarkStart w:id="69" w:name="X66157dae7f690194bb63d972c92fdb7003571c3"/>
     <w:p>
       <w:pPr>
         <w:pStyle w:val="Heading2"/>
@@ -3331,8 +4201,8 @@
         <w:t xml:space="preserve">The protocol makes three abstract ideas tangible: that generated content has structure beyond its surface text, that the structure depends on human design choices, and that it can be inspected. Its evaluation, with measures of students’ understanding before and after, is left for future work.</w:t>
       </w:r>
     </w:p>
-    <w:bookmarkEnd w:id="51"/>
-    <w:bookmarkStart w:id="52" w:name="limitations"/>
+    <w:bookmarkEnd w:id="69"/>
+    <w:bookmarkStart w:id="70" w:name="limitations"/>
     <w:p>
       <w:pPr>
         <w:pStyle w:val="Heading2"/>
@@ -3364,9 +4234,9 @@
         <w:t xml:space="preserve">; we reported alternative definitions for that reason. The premise coding was done by a single coder from the world texts; a second, independent coding is needed. The declared causes were validated by judge models of the same family and not yet by human annotators, whose annotation has been prepared. Finally, no learners took part in this study: the educational implications are arguments for future classroom work, not results.</w:t>
       </w:r>
     </w:p>
-    <w:bookmarkEnd w:id="52"/>
-    <w:bookmarkEnd w:id="53"/>
-    <w:bookmarkStart w:id="54" w:name="conclusion"/>
+    <w:bookmarkEnd w:id="70"/>
+    <w:bookmarkEnd w:id="71"/>
+    <w:bookmarkStart w:id="72" w:name="conclusion"/>
     <w:p>
       <w:pPr>
         <w:pStyle w:val="Heading1"/>
@@ -3383,8 +4253,8 @@
         <w:t xml:space="preserve">Left to act freely in a shared world, language-model agents do not produce a web of stories that open and close. They produce one story, quickly, because almost every action is tied to something that already happened. Which threads merge first, and where, is decided by attractors: the entangled premises and the places they name, written by the humans who designed the world. For education, the lesson is double. Generative role-play is not as open as it feels, and the reasons are structural rather than stylistic; and the forces that shape it are authored, legible and teachable. Making students read the causal graph of a story they co-created with AI, and change the world to see it converge differently, is a concrete way of practising critical AI literacy.</w:t>
       </w:r>
     </w:p>
-    <w:bookmarkEnd w:id="54"/>
-    <w:bookmarkStart w:id="55" w:name="data-and-code-availability"/>
+    <w:bookmarkEnd w:id="72"/>
+    <w:bookmarkStart w:id="73" w:name="data-and-code-availability"/>
     <w:p>
       <w:pPr>
         <w:pStyle w:val="Heading1"/>
@@ -3401,8 +4271,8 @@
         <w:t xml:space="preserve">The simulator, the pre-registration and its amendments, the event logs of all sessions and the analysis scripts are available in a public repository [repository link removed for anonymous review].</w:t>
       </w:r>
     </w:p>
-    <w:bookmarkEnd w:id="55"/>
-    <w:bookmarkStart w:id="111" w:name="references"/>
+    <w:bookmarkEnd w:id="73"/>
+    <w:bookmarkStart w:id="169" w:name="references"/>
     <w:p>
       <w:pPr>
         <w:pStyle w:val="Heading1"/>
@@ -3412,8 +4282,8 @@
         <w:t xml:space="preserve">References</w:t>
       </w:r>
     </w:p>
-    <w:bookmarkStart w:id="110" w:name="refs"/>
-    <w:bookmarkStart w:id="56" w:name="ref-aylett1999"/>
+    <w:bookmarkStart w:id="168" w:name="refs"/>
+    <w:bookmarkStart w:id="74" w:name="ref-aylett1999"/>
     <w:p>
       <w:pPr>
         <w:pStyle w:val="Bibliography"/>
@@ -3438,8 +4308,8 @@
         <w:t xml:space="preserve">, 83–86.</w:t>
       </w:r>
     </w:p>
-    <w:bookmarkEnd w:id="56"/>
-    <w:bookmarkStart w:id="58" w:name="ref-barabasi1999"/>
+    <w:bookmarkEnd w:id="74"/>
+    <w:bookmarkStart w:id="76" w:name="ref-barabasi1999"/>
     <w:p>
       <w:pPr>
         <w:pStyle w:val="Bibliography"/>
@@ -3479,7 +4349,7 @@
       <w:r>
         <w:t xml:space="preserve"> </w:t>
       </w:r>
-      <w:hyperlink r:id="rId57">
+      <w:hyperlink r:id="rId75">
         <w:r>
           <w:rPr>
             <w:rStyle w:val="Hyperlink"/>
@@ -3488,8 +4358,8 @@
         </w:r>
       </w:hyperlink>
     </w:p>
-    <w:bookmarkEnd w:id="58"/>
-    <w:bookmarkStart w:id="60" w:name="ref-barthes1975"/>
+    <w:bookmarkEnd w:id="76"/>
+    <w:bookmarkStart w:id="78" w:name="ref-barthes1975"/>
     <w:p>
       <w:pPr>
         <w:pStyle w:val="Bibliography"/>
@@ -3529,7 +4399,7 @@
       <w:r>
         <w:t xml:space="preserve"> </w:t>
       </w:r>
-      <w:hyperlink r:id="rId59">
+      <w:hyperlink r:id="rId77">
         <w:r>
           <w:rPr>
             <w:rStyle w:val="Hyperlink"/>
@@ -3538,8 +4408,8 @@
         </w:r>
       </w:hyperlink>
     </w:p>
-    <w:bookmarkEnd w:id="60"/>
-    <w:bookmarkStart w:id="62" w:name="ref-begus2024"/>
+    <w:bookmarkEnd w:id="78"/>
+    <w:bookmarkStart w:id="80" w:name="ref-begus2024"/>
     <w:p>
       <w:pPr>
         <w:pStyle w:val="Bibliography"/>
@@ -3591,7 +4461,7 @@
       <w:r>
         <w:t xml:space="preserve"> </w:t>
       </w:r>
-      <w:hyperlink r:id="rId61">
+      <w:hyperlink r:id="rId79">
         <w:r>
           <w:rPr>
             <w:rStyle w:val="Hyperlink"/>
@@ -3600,8 +4470,8 @@
         </w:r>
       </w:hyperlink>
     </w:p>
-    <w:bookmarkEnd w:id="62"/>
-    <w:bookmarkStart w:id="64" w:name="ref-blondel2008"/>
+    <w:bookmarkEnd w:id="80"/>
+    <w:bookmarkStart w:id="82" w:name="ref-blondel2008"/>
     <w:p>
       <w:pPr>
         <w:pStyle w:val="Bibliography"/>
@@ -3641,7 +4511,7 @@
       <w:r>
         <w:t xml:space="preserve"> </w:t>
       </w:r>
-      <w:hyperlink r:id="rId63">
+      <w:hyperlink r:id="rId81">
         <w:r>
           <w:rPr>
             <w:rStyle w:val="Hyperlink"/>
@@ -3650,8 +4520,8 @@
         </w:r>
       </w:hyperlink>
     </w:p>
-    <w:bookmarkEnd w:id="64"/>
-    <w:bookmarkStart w:id="65" w:name="ref-bowman2010"/>
+    <w:bookmarkEnd w:id="82"/>
+    <w:bookmarkStart w:id="83" w:name="ref-bowman2010"/>
     <w:p>
       <w:pPr>
         <w:pStyle w:val="Bibliography"/>
@@ -3676,8 +4546,8 @@
         <w:t xml:space="preserve">. McFarland.</w:t>
       </w:r>
     </w:p>
-    <w:bookmarkEnd w:id="65"/>
-    <w:bookmarkStart w:id="67" w:name="ref-callisonburch2022"/>
+    <w:bookmarkEnd w:id="83"/>
+    <w:bookmarkStart w:id="85" w:name="ref-revatr33"/>
     <w:p>
       <w:pPr>
         <w:pStyle w:val="Bibliography"/>
@@ -3686,6 +4556,71 @@
         <w:jc w:val="left"/>
       </w:pPr>
       <w:r>
+        <w:t xml:space="preserve">Brito, M. H. (2025).</w:t>
+      </w:r>
+      <w:r>
+        <w:t xml:space="preserve"> </w:t>
+      </w:r>
+      <w:r>
+        <w:rPr>
+          <w:i/>
+          <w:iCs/>
+        </w:rPr>
+        <w:t xml:space="preserve">Many stories, one shape: Narrative convergence in</w:t>
+      </w:r>
+      <w:r>
+        <w:rPr>
+          <w:i/>
+          <w:iCs/>
+        </w:rPr>
+        <w:t xml:space="preserve"> </w:t>
+      </w:r>
+      <w:r>
+        <w:rPr>
+          <w:i/>
+          <w:iCs/>
+        </w:rPr>
+        <w:t xml:space="preserve">AI-Generated</w:t>
+      </w:r>
+      <w:r>
+        <w:rPr>
+          <w:i/>
+          <w:iCs/>
+        </w:rPr>
+        <w:t xml:space="preserve"> </w:t>
+      </w:r>
+      <w:r>
+        <w:rPr>
+          <w:i/>
+          <w:iCs/>
+        </w:rPr>
+        <w:t xml:space="preserve">fiction</w:t>
+      </w:r>
+      <w:r>
+        <w:t xml:space="preserve">. Digital Kenyon (Kenyon College).</w:t>
+      </w:r>
+      <w:r>
+        <w:t xml:space="preserve"> </w:t>
+      </w:r>
+      <w:hyperlink r:id="rId84">
+        <w:r>
+          <w:rPr>
+            <w:rStyle w:val="Hyperlink"/>
+          </w:rPr>
+          <w:t xml:space="preserve">https://openalex.org/W7125764248</w:t>
+        </w:r>
+      </w:hyperlink>
+    </w:p>
+    <w:bookmarkEnd w:id="85"/>
+    <w:bookmarkStart w:id="87" w:name="ref-callisonburch2022"/>
+    <w:p>
+      <w:pPr>
+        <w:pStyle w:val="Bibliography"/>
+        <w:spacing w:line="480" w:lineRule="auto" w:after="0"/>
+        <w:ind w:left="709" w:hanging="709"/>
+        <w:jc w:val="left"/>
+      </w:pPr>
+      <w:r>
         <w:t xml:space="preserve">Callison-Burch, C., Tomar, G. S., Martin, L. J., Ippolito, D., Bailis, S., &amp; Reitter, D. (2022).</w:t>
       </w:r>
       <w:r>
@@ -3716,7 +4651,7 @@
       <w:r>
         <w:t xml:space="preserve"> </w:t>
       </w:r>
-      <w:hyperlink r:id="rId66">
+      <w:hyperlink r:id="rId86">
         <w:r>
           <w:rPr>
             <w:rStyle w:val="Hyperlink"/>
@@ -3725,8 +4660,8 @@
         </w:r>
       </w:hyperlink>
     </w:p>
-    <w:bookmarkEnd w:id="67"/>
-    <w:bookmarkStart w:id="68" w:name="ref-chatman1978"/>
+    <w:bookmarkEnd w:id="87"/>
+    <w:bookmarkStart w:id="88" w:name="ref-chatman1978"/>
     <w:p>
       <w:pPr>
         <w:pStyle w:val="Bibliography"/>
@@ -3751,8 +4686,8 @@
         <w:t xml:space="preserve">. Cornell University Press.</w:t>
       </w:r>
     </w:p>
-    <w:bookmarkEnd w:id="68"/>
-    <w:bookmarkStart w:id="70" w:name="ref-daniau2016"/>
+    <w:bookmarkEnd w:id="88"/>
+    <w:bookmarkStart w:id="90" w:name="ref-revatr18"/>
     <w:p>
       <w:pPr>
         <w:pStyle w:val="Bibliography"/>
@@ -3761,6 +4696,56 @@
         <w:jc w:val="left"/>
       </w:pPr>
       <w:r>
+        <w:t xml:space="preserve">Chen, Z., Pan, R., &amp; Li, H. (2026). StoryBox: Collaborative multi-agent simulation for hybrid bottom-up long-form story generation using large language models.</w:t>
+      </w:r>
+      <w:r>
+        <w:t xml:space="preserve"> </w:t>
+      </w:r>
+      <w:r>
+        <w:rPr>
+          <w:i/>
+          <w:iCs/>
+        </w:rPr>
+        <w:t xml:space="preserve">Proceedings of the AAAI Conference on Artificial Intelligence</w:t>
+      </w:r>
+      <w:r>
+        <w:t xml:space="preserve">,</w:t>
+      </w:r>
+      <w:r>
+        <w:t xml:space="preserve"> </w:t>
+      </w:r>
+      <w:r>
+        <w:rPr>
+          <w:i/>
+          <w:iCs/>
+        </w:rPr>
+        <w:t xml:space="preserve">40</w:t>
+      </w:r>
+      <w:r>
+        <w:t xml:space="preserve">(36), 30359–30367.</w:t>
+      </w:r>
+      <w:r>
+        <w:t xml:space="preserve"> </w:t>
+      </w:r>
+      <w:hyperlink r:id="rId89">
+        <w:r>
+          <w:rPr>
+            <w:rStyle w:val="Hyperlink"/>
+          </w:rPr>
+          <w:t xml:space="preserve">https://doi.org/10.1609/aaai.v40i36.40288</w:t>
+        </w:r>
+      </w:hyperlink>
+    </w:p>
+    <w:bookmarkEnd w:id="90"/>
+    <w:bookmarkStart w:id="92" w:name="ref-daniau2016"/>
+    <w:p>
+      <w:pPr>
+        <w:pStyle w:val="Bibliography"/>
+        <w:spacing w:line="480" w:lineRule="auto" w:after="0"/>
+        <w:ind w:left="709" w:hanging="709"/>
+        <w:jc w:val="left"/>
+      </w:pPr>
+      <w:r>
         <w:t xml:space="preserve">Daniau, S. (2016). The transformative potential of role-playing games: From play skills to human skills.</w:t>
       </w:r>
       <w:r>
@@ -3792,7 +4777,7 @@
       <w:r>
         <w:t xml:space="preserve"> </w:t>
       </w:r>
-      <w:hyperlink r:id="rId69">
+      <w:hyperlink r:id="rId91">
         <w:r>
           <w:rPr>
             <w:rStyle w:val="Hyperlink"/>
@@ -3801,8 +4786,8 @@
         </w:r>
       </w:hyperlink>
     </w:p>
-    <w:bookmarkEnd w:id="70"/>
-    <w:bookmarkStart w:id="72" w:name="ref-doshi2024"/>
+    <w:bookmarkEnd w:id="92"/>
+    <w:bookmarkStart w:id="94" w:name="ref-doshi2024"/>
     <w:p>
       <w:pPr>
         <w:pStyle w:val="Bibliography"/>
@@ -3854,7 +4839,7 @@
       <w:r>
         <w:t xml:space="preserve"> </w:t>
       </w:r>
-      <w:hyperlink r:id="rId71">
+      <w:hyperlink r:id="rId93">
         <w:r>
           <w:rPr>
             <w:rStyle w:val="Hyperlink"/>
@@ -3863,8 +4848,8 @@
         </w:r>
       </w:hyperlink>
     </w:p>
-    <w:bookmarkEnd w:id="72"/>
-    <w:bookmarkStart w:id="73" w:name="ref-fine1983"/>
+    <w:bookmarkEnd w:id="94"/>
+    <w:bookmarkStart w:id="96" w:name="ref-revatr42"/>
     <w:p>
       <w:pPr>
         <w:pStyle w:val="Bibliography"/>
@@ -3873,24 +4858,35 @@
         <w:jc w:val="left"/>
       </w:pPr>
       <w:r>
-        <w:t xml:space="preserve">Fine, G. A. (1983).</w:t>
-      </w:r>
-      <w:r>
-        <w:t xml:space="preserve"> </w:t>
-      </w:r>
-      <w:r>
-        <w:rPr>
-          <w:i/>
-          <w:iCs/>
-        </w:rPr>
-        <w:t xml:space="preserve">Shared fantasy: Role-playing games as social worlds</w:t>
-      </w:r>
-      <w:r>
-        <w:t xml:space="preserve">. University of Chicago Press.</w:t>
-      </w:r>
-    </w:p>
-    <w:bookmarkEnd w:id="73"/>
-    <w:bookmarkStart w:id="74" w:name="ref-hobbs2010"/>
+        <w:t xml:space="preserve">Farrell, R., &amp; Ware, S. G. (2024).</w:t>
+      </w:r>
+      <w:r>
+        <w:t xml:space="preserve"> </w:t>
+      </w:r>
+      <w:r>
+        <w:rPr>
+          <w:i/>
+          <w:iCs/>
+        </w:rPr>
+        <w:t xml:space="preserve">Planning stories neurally</w:t>
+      </w:r>
+      <w:r>
+        <w:t xml:space="preserve">.</w:t>
+      </w:r>
+      <w:r>
+        <w:t xml:space="preserve"> </w:t>
+      </w:r>
+      <w:hyperlink r:id="rId95">
+        <w:r>
+          <w:rPr>
+            <w:rStyle w:val="Hyperlink"/>
+          </w:rPr>
+          <w:t xml:space="preserve">https://doi.org/10.36227/techrxiv.171085113.35202301/v1</w:t>
+        </w:r>
+      </w:hyperlink>
+    </w:p>
+    <w:bookmarkEnd w:id="96"/>
+    <w:bookmarkStart w:id="97" w:name="ref-fine1983"/>
     <w:p>
       <w:pPr>
         <w:pStyle w:val="Bibliography"/>
@@ -3899,24 +4895,24 @@
         <w:jc w:val="left"/>
       </w:pPr>
       <w:r>
-        <w:t xml:space="preserve">Hobbs, R. (2010).</w:t>
-      </w:r>
-      <w:r>
-        <w:t xml:space="preserve"> </w:t>
-      </w:r>
-      <w:r>
-        <w:rPr>
-          <w:i/>
-          <w:iCs/>
-        </w:rPr>
-        <w:t xml:space="preserve">Digital and media literacy: A plan of action</w:t>
-      </w:r>
-      <w:r>
-        <w:t xml:space="preserve">. The Aspen Institute.</w:t>
-      </w:r>
-    </w:p>
-    <w:bookmarkEnd w:id="74"/>
-    <w:bookmarkStart w:id="75" w:name="ref-jenkins2004"/>
+        <w:t xml:space="preserve">Fine, G. A. (1983).</w:t>
+      </w:r>
+      <w:r>
+        <w:t xml:space="preserve"> </w:t>
+      </w:r>
+      <w:r>
+        <w:rPr>
+          <w:i/>
+          <w:iCs/>
+        </w:rPr>
+        <w:t xml:space="preserve">Shared fantasy: Role-playing games as social worlds</w:t>
+      </w:r>
+      <w:r>
+        <w:t xml:space="preserve">. University of Chicago Press.</w:t>
+      </w:r>
+    </w:p>
+    <w:bookmarkEnd w:id="97"/>
+    <w:bookmarkStart w:id="99" w:name="ref-revatr29"/>
     <w:p>
       <w:pPr>
         <w:pStyle w:val="Bibliography"/>
@@ -3925,27 +4921,44 @@
         <w:jc w:val="left"/>
       </w:pPr>
       <w:r>
-        <w:t xml:space="preserve">Jenkins, H. (2004). Game design as narrative architecture. In N. Wardrip-Fruin &amp; P. Harrigan (Eds.),</w:t>
-      </w:r>
-      <w:r>
-        <w:t xml:space="preserve"> </w:t>
-      </w:r>
-      <w:r>
-        <w:rPr>
-          <w:i/>
-          <w:iCs/>
-        </w:rPr>
-        <w:t xml:space="preserve">First person: New media as story, performance, and game</w:t>
-      </w:r>
-      <w:r>
-        <w:t xml:space="preserve"> </w:t>
-      </w:r>
-      <w:r>
-        <w:t xml:space="preserve">(pp. 118–130). MIT Press.</w:t>
-      </w:r>
-    </w:p>
-    <w:bookmarkEnd w:id="75"/>
-    <w:bookmarkStart w:id="77" w:name="ref-kreminski2018"/>
+        <w:t xml:space="preserve">Habib, M., &amp; Sathyanath, A. (2025).</w:t>
+      </w:r>
+      <w:r>
+        <w:t xml:space="preserve"> </w:t>
+      </w:r>
+      <w:r>
+        <w:t xml:space="preserve">GENOME</w:t>
+      </w:r>
+      <w:r>
+        <w:t xml:space="preserve">: A multi-agent NeuroSymbolic simulation framework for coherent, memory-evolved long-form story generation.</w:t>
+      </w:r>
+      <w:r>
+        <w:t xml:space="preserve"> </w:t>
+      </w:r>
+      <w:r>
+        <w:rPr>
+          <w:i/>
+          <w:iCs/>
+        </w:rPr>
+        <w:t xml:space="preserve">2025 International Conference on Emerging Research in Computational Science (ICERCS)</w:t>
+      </w:r>
+      <w:r>
+        <w:t xml:space="preserve">, 1–5.</w:t>
+      </w:r>
+      <w:r>
+        <w:t xml:space="preserve"> </w:t>
+      </w:r>
+      <w:hyperlink r:id="rId98">
+        <w:r>
+          <w:rPr>
+            <w:rStyle w:val="Hyperlink"/>
+          </w:rPr>
+          <w:t xml:space="preserve">https://doi.org/10.1109/icercs65898.2025.11580934</w:t>
+        </w:r>
+      </w:hyperlink>
+    </w:p>
+    <w:bookmarkEnd w:id="99"/>
+    <w:bookmarkStart w:id="101" w:name="ref-revatr09"/>
     <w:p>
       <w:pPr>
         <w:pStyle w:val="Bibliography"/>
@@ -3954,6 +4967,172 @@
         <w:jc w:val="left"/>
       </w:pPr>
       <w:r>
+        <w:t xml:space="preserve">Ho, C., Aluru, A., Hammouri, M., Luo, K., Lagasse, R., Bahuguna, A., &amp; Sharma, V. (2026).</w:t>
+      </w:r>
+      <w:r>
+        <w:t xml:space="preserve"> </w:t>
+      </w:r>
+      <w:r>
+        <w:rPr>
+          <w:i/>
+          <w:iCs/>
+        </w:rPr>
+        <w:t xml:space="preserve">From personas to plot: Character-grounded multi-agent story generation for long-form narratives</w:t>
+      </w:r>
+      <w:r>
+        <w:t xml:space="preserve">. arXiv preprint.</w:t>
+      </w:r>
+      <w:r>
+        <w:t xml:space="preserve"> </w:t>
+      </w:r>
+      <w:hyperlink r:id="rId100">
+        <w:r>
+          <w:rPr>
+            <w:rStyle w:val="Hyperlink"/>
+          </w:rPr>
+          <w:t xml:space="preserve">https://doi.org/10.48550/ARXIV.2607.00918</w:t>
+        </w:r>
+      </w:hyperlink>
+    </w:p>
+    <w:bookmarkEnd w:id="101"/>
+    <w:bookmarkStart w:id="102" w:name="ref-hobbs2010"/>
+    <w:p>
+      <w:pPr>
+        <w:pStyle w:val="Bibliography"/>
+        <w:spacing w:line="480" w:lineRule="auto" w:after="0"/>
+        <w:ind w:left="709" w:hanging="709"/>
+        <w:jc w:val="left"/>
+      </w:pPr>
+      <w:r>
+        <w:t xml:space="preserve">Hobbs, R. (2010).</w:t>
+      </w:r>
+      <w:r>
+        <w:t xml:space="preserve"> </w:t>
+      </w:r>
+      <w:r>
+        <w:rPr>
+          <w:i/>
+          <w:iCs/>
+        </w:rPr>
+        <w:t xml:space="preserve">Digital and media literacy: A plan of action</w:t>
+      </w:r>
+      <w:r>
+        <w:t xml:space="preserve">. The Aspen Institute.</w:t>
+      </w:r>
+    </w:p>
+    <w:bookmarkEnd w:id="102"/>
+    <w:bookmarkStart w:id="103" w:name="ref-jenkins2004"/>
+    <w:p>
+      <w:pPr>
+        <w:pStyle w:val="Bibliography"/>
+        <w:spacing w:line="480" w:lineRule="auto" w:after="0"/>
+        <w:ind w:left="709" w:hanging="709"/>
+        <w:jc w:val="left"/>
+      </w:pPr>
+      <w:r>
+        <w:t xml:space="preserve">Jenkins, H. (2004). Game design as narrative architecture. In N. Wardrip-Fruin &amp; P. Harrigan (Eds.),</w:t>
+      </w:r>
+      <w:r>
+        <w:t xml:space="preserve"> </w:t>
+      </w:r>
+      <w:r>
+        <w:rPr>
+          <w:i/>
+          <w:iCs/>
+        </w:rPr>
+        <w:t xml:space="preserve">First person: New media as story, performance, and game</w:t>
+      </w:r>
+      <w:r>
+        <w:t xml:space="preserve"> </w:t>
+      </w:r>
+      <w:r>
+        <w:t xml:space="preserve">(pp. 118–130). MIT Press.</w:t>
+      </w:r>
+    </w:p>
+    <w:bookmarkEnd w:id="103"/>
+    <w:bookmarkStart w:id="105" w:name="ref-revatr12"/>
+    <w:p>
+      <w:pPr>
+        <w:pStyle w:val="Bibliography"/>
+        <w:spacing w:line="480" w:lineRule="auto" w:after="0"/>
+        <w:ind w:left="709" w:hanging="709"/>
+        <w:jc w:val="left"/>
+      </w:pPr>
+      <w:r>
+        <w:t xml:space="preserve">Jørgensen, N. H., Tharmabalan, S., Aslan, I., Brodersen Hansen, N., &amp; Merritt, T. (2026). Guiding, not railroading: Design and evaluation of a multi-agent system for narrative redirection in role-playing games.</w:t>
+      </w:r>
+      <w:r>
+        <w:t xml:space="preserve"> </w:t>
+      </w:r>
+      <w:r>
+        <w:rPr>
+          <w:i/>
+          <w:iCs/>
+        </w:rPr>
+        <w:t xml:space="preserve">Proceedings of the 31st International Conference on Intelligent User Interfaces</w:t>
+      </w:r>
+      <w:r>
+        <w:t xml:space="preserve">, 1551–1601.</w:t>
+      </w:r>
+      <w:r>
+        <w:t xml:space="preserve"> </w:t>
+      </w:r>
+      <w:hyperlink r:id="rId104">
+        <w:r>
+          <w:rPr>
+            <w:rStyle w:val="Hyperlink"/>
+          </w:rPr>
+          <w:t xml:space="preserve">https://doi.org/10.1145/3742413.3789218</w:t>
+        </w:r>
+      </w:hyperlink>
+    </w:p>
+    <w:bookmarkEnd w:id="105"/>
+    <w:bookmarkStart w:id="107" w:name="ref-revatr15"/>
+    <w:p>
+      <w:pPr>
+        <w:pStyle w:val="Bibliography"/>
+        <w:spacing w:line="480" w:lineRule="auto" w:after="0"/>
+        <w:ind w:left="709" w:hanging="709"/>
+        <w:jc w:val="left"/>
+      </w:pPr>
+      <w:r>
+        <w:t xml:space="preserve">Khalid, H., Shapsough, S., &amp; Zualkernan, I. (2026). Noise steering for controlled text generation: Improving diversity and reading-level fidelity in arabic educational story generation.</w:t>
+      </w:r>
+      <w:r>
+        <w:t xml:space="preserve"> </w:t>
+      </w:r>
+      <w:r>
+        <w:rPr>
+          <w:i/>
+          <w:iCs/>
+        </w:rPr>
+        <w:t xml:space="preserve">Proceedings of the 21st Workshop on Innovative Use of NLP for Building Educational Applications (BEA 2026)</w:t>
+      </w:r>
+      <w:r>
+        <w:t xml:space="preserve">, 581–597.</w:t>
+      </w:r>
+      <w:r>
+        <w:t xml:space="preserve"> </w:t>
+      </w:r>
+      <w:hyperlink r:id="rId106">
+        <w:r>
+          <w:rPr>
+            <w:rStyle w:val="Hyperlink"/>
+          </w:rPr>
+          <w:t xml:space="preserve">https://doi.org/10.18653/v1/2026.bea-1.41</w:t>
+        </w:r>
+      </w:hyperlink>
+    </w:p>
+    <w:bookmarkEnd w:id="107"/>
+    <w:bookmarkStart w:id="109" w:name="ref-kreminski2018"/>
+    <w:p>
+      <w:pPr>
+        <w:pStyle w:val="Bibliography"/>
+        <w:spacing w:line="480" w:lineRule="auto" w:after="0"/>
+        <w:ind w:left="709" w:hanging="709"/>
+        <w:jc w:val="left"/>
+      </w:pPr>
+      <w:r>
         <w:t xml:space="preserve">Kreminski, M., &amp; Wardrip-Fruin, N. (2018). Sketching a map of the storylets design space. In</w:t>
       </w:r>
       <w:r>
@@ -3975,7 +5154,7 @@
       <w:r>
         <w:t xml:space="preserve"> </w:t>
       </w:r>
-      <w:hyperlink r:id="rId76">
+      <w:hyperlink r:id="rId108">
         <w:r>
           <w:rPr>
             <w:rStyle w:val="Hyperlink"/>
@@ -3984,8 +5163,8 @@
         </w:r>
       </w:hyperlink>
     </w:p>
-    <w:bookmarkEnd w:id="77"/>
-    <w:bookmarkStart w:id="79" w:name="ref-long2020"/>
+    <w:bookmarkEnd w:id="109"/>
+    <w:bookmarkStart w:id="111" w:name="ref-revatr39"/>
     <w:p>
       <w:pPr>
         <w:pStyle w:val="Bibliography"/>
@@ -3994,6 +5173,123 @@
         <w:jc w:val="left"/>
       </w:pPr>
       <w:r>
+        <w:t xml:space="preserve">Leandro, J., Rao, S., Xu, M., Xu, W., Jojic, N., Brockett, C., &amp; Dolan, B. (2024).</w:t>
+      </w:r>
+      <w:r>
+        <w:t xml:space="preserve"> </w:t>
+      </w:r>
+      <w:r>
+        <w:t xml:space="preserve">GENEVA</w:t>
+      </w:r>
+      <w:r>
+        <w:t xml:space="preserve">:</w:t>
+      </w:r>
+      <w:r>
+        <w:t xml:space="preserve"> </w:t>
+      </w:r>
+      <w:r>
+        <w:t xml:space="preserve">GENErating</w:t>
+      </w:r>
+      <w:r>
+        <w:t xml:space="preserve"> </w:t>
+      </w:r>
+      <w:r>
+        <w:t xml:space="preserve">and visualizing branching narratives using</w:t>
+      </w:r>
+      <w:r>
+        <w:t xml:space="preserve"> </w:t>
+      </w:r>
+      <w:r>
+        <w:t xml:space="preserve">LLMs</w:t>
+      </w:r>
+      <w:r>
+        <w:t xml:space="preserve">.</w:t>
+      </w:r>
+      <w:r>
+        <w:t xml:space="preserve"> </w:t>
+      </w:r>
+      <w:r>
+        <w:rPr>
+          <w:i/>
+          <w:iCs/>
+        </w:rPr>
+        <w:t xml:space="preserve">2024 IEEE Conference on Games (CoG)</w:t>
+      </w:r>
+      <w:r>
+        <w:t xml:space="preserve">, 1–5.</w:t>
+      </w:r>
+      <w:r>
+        <w:t xml:space="preserve"> </w:t>
+      </w:r>
+      <w:hyperlink r:id="rId110">
+        <w:r>
+          <w:rPr>
+            <w:rStyle w:val="Hyperlink"/>
+          </w:rPr>
+          <w:t xml:space="preserve">https://doi.org/10.1109/cog60054.2024.10645625</w:t>
+        </w:r>
+      </w:hyperlink>
+    </w:p>
+    <w:bookmarkEnd w:id="111"/>
+    <w:bookmarkStart w:id="113" w:name="ref-revatr02"/>
+    <w:p>
+      <w:pPr>
+        <w:pStyle w:val="Bibliography"/>
+        <w:spacing w:line="480" w:lineRule="auto" w:after="0"/>
+        <w:ind w:left="709" w:hanging="709"/>
+        <w:jc w:val="left"/>
+      </w:pPr>
+      <w:r>
+        <w:t xml:space="preserve">Lee, S., Kim, H., Kang, S., Kim, H., &amp; Oh, D. (2026). A structured reasoning framework for causally consistent narrative generation via evidence-conditioned candidate-set control.</w:t>
+      </w:r>
+      <w:r>
+        <w:t xml:space="preserve"> </w:t>
+      </w:r>
+      <w:r>
+        <w:rPr>
+          <w:i/>
+          <w:iCs/>
+        </w:rPr>
+        <w:t xml:space="preserve">Knowledge-Based Systems</w:t>
+      </w:r>
+      <w:r>
+        <w:t xml:space="preserve">,</w:t>
+      </w:r>
+      <w:r>
+        <w:t xml:space="preserve"> </w:t>
+      </w:r>
+      <w:r>
+        <w:rPr>
+          <w:i/>
+          <w:iCs/>
+        </w:rPr>
+        <w:t xml:space="preserve">352</w:t>
+      </w:r>
+      <w:r>
+        <w:t xml:space="preserve">, 117032.</w:t>
+      </w:r>
+      <w:r>
+        <w:t xml:space="preserve"> </w:t>
+      </w:r>
+      <w:hyperlink r:id="rId112">
+        <w:r>
+          <w:rPr>
+            <w:rStyle w:val="Hyperlink"/>
+          </w:rPr>
+          <w:t xml:space="preserve">https://doi.org/10.1016/j.knosys.2026.117032</w:t>
+        </w:r>
+      </w:hyperlink>
+    </w:p>
+    <w:bookmarkEnd w:id="113"/>
+    <w:bookmarkStart w:id="115" w:name="ref-long2020"/>
+    <w:p>
+      <w:pPr>
+        <w:pStyle w:val="Bibliography"/>
+        <w:spacing w:line="480" w:lineRule="auto" w:after="0"/>
+        <w:ind w:left="709" w:hanging="709"/>
+        <w:jc w:val="left"/>
+      </w:pPr>
+      <w:r>
         <w:t xml:space="preserve">Long, D., &amp; Magerko, B. (2020). What is</w:t>
       </w:r>
       <w:r>
@@ -4024,7 +5320,7 @@
       <w:r>
         <w:t xml:space="preserve"> </w:t>
       </w:r>
-      <w:hyperlink r:id="rId78">
+      <w:hyperlink r:id="rId114">
         <w:r>
           <w:rPr>
             <w:rStyle w:val="Hyperlink"/>
@@ -4033,8 +5329,8 @@
         </w:r>
       </w:hyperlink>
     </w:p>
-    <w:bookmarkEnd w:id="79"/>
-    <w:bookmarkStart w:id="81" w:name="ref-lorenz1963"/>
+    <w:bookmarkEnd w:id="115"/>
+    <w:bookmarkStart w:id="117" w:name="ref-lorenz1963"/>
     <w:p>
       <w:pPr>
         <w:pStyle w:val="Bibliography"/>
@@ -4074,7 +5370,7 @@
       <w:r>
         <w:t xml:space="preserve"> </w:t>
       </w:r>
-      <w:hyperlink r:id="rId80">
+      <w:hyperlink r:id="rId116">
         <w:r>
           <w:rPr>
             <w:rStyle w:val="Hyperlink"/>
@@ -4083,8 +5379,8 @@
         </w:r>
       </w:hyperlink>
     </w:p>
-    <w:bookmarkEnd w:id="81"/>
-    <w:bookmarkStart w:id="83" w:name="ref-louchart2004"/>
+    <w:bookmarkEnd w:id="117"/>
+    <w:bookmarkStart w:id="119" w:name="ref-louchart2004"/>
     <w:p>
       <w:pPr>
         <w:pStyle w:val="Bibliography"/>
@@ -4124,7 +5420,7 @@
       <w:r>
         <w:t xml:space="preserve"> </w:t>
       </w:r>
-      <w:hyperlink r:id="rId82">
+      <w:hyperlink r:id="rId118">
         <w:r>
           <w:rPr>
             <w:rStyle w:val="Hyperlink"/>
@@ -4133,8 +5429,8 @@
         </w:r>
       </w:hyperlink>
     </w:p>
-    <w:bookmarkEnd w:id="83"/>
-    <w:bookmarkStart w:id="84" w:name="ref-mateas2003"/>
+    <w:bookmarkEnd w:id="119"/>
+    <w:bookmarkStart w:id="121" w:name="ref-revatr06"/>
     <w:p>
       <w:pPr>
         <w:pStyle w:val="Bibliography"/>
@@ -4143,30 +5439,63 @@
         <w:jc w:val="left"/>
       </w:pPr>
       <w:r>
-        <w:t xml:space="preserve">Mateas, M., &amp; Stern, A. (2003). Fa</w:t>
-      </w:r>
-      <w:r>
-        <w:t xml:space="preserve">ç</w:t>
-      </w:r>
-      <w:r>
-        <w:t xml:space="preserve">ade: An experiment in building a fully-realized interactive drama.</w:t>
-      </w:r>
-      <w:r>
-        <w:t xml:space="preserve"> </w:t>
-      </w:r>
-      <w:r>
-        <w:rPr>
-          <w:i/>
-          <w:iCs/>
-        </w:rPr>
-        <w:t xml:space="preserve">Game Developers Conference, Game Design Track</w:t>
-      </w:r>
-      <w:r>
-        <w:t xml:space="preserve">.</w:t>
-      </w:r>
-    </w:p>
-    <w:bookmarkEnd w:id="84"/>
-    <w:bookmarkStart w:id="86" w:name="ref-montola2008"/>
+        <w:t xml:space="preserve">Ma, Y., Shi, K., He, H., Zhang, Z., Lei, Z., Qiu, Z., Hu, R., &amp; Liu, J. (2026).</w:t>
+      </w:r>
+      <w:r>
+        <w:t xml:space="preserve"> </w:t>
+      </w:r>
+      <w:r>
+        <w:rPr>
+          <w:i/>
+          <w:iCs/>
+        </w:rPr>
+        <w:t xml:space="preserve">Creative convergence or imitation? Genre-specific homogeneity in</w:t>
+      </w:r>
+      <w:r>
+        <w:rPr>
+          <w:i/>
+          <w:iCs/>
+        </w:rPr>
+        <w:t xml:space="preserve"> </w:t>
+      </w:r>
+      <w:r>
+        <w:rPr>
+          <w:i/>
+          <w:iCs/>
+        </w:rPr>
+        <w:t xml:space="preserve">LLM-Generated</w:t>
+      </w:r>
+      <w:r>
+        <w:rPr>
+          <w:i/>
+          <w:iCs/>
+        </w:rPr>
+        <w:t xml:space="preserve"> </w:t>
+      </w:r>
+      <w:r>
+        <w:rPr>
+          <w:i/>
+          <w:iCs/>
+        </w:rPr>
+        <w:t xml:space="preserve">chinese literature</w:t>
+      </w:r>
+      <w:r>
+        <w:t xml:space="preserve">. arXiv preprint.</w:t>
+      </w:r>
+      <w:r>
+        <w:t xml:space="preserve"> </w:t>
+      </w:r>
+      <w:hyperlink r:id="rId120">
+        <w:r>
+          <w:rPr>
+            <w:rStyle w:val="Hyperlink"/>
+          </w:rPr>
+          <w:t xml:space="preserve">https://doi.org/10.48550/ARXIV.2603.14430</w:t>
+        </w:r>
+      </w:hyperlink>
+    </w:p>
+    <w:bookmarkEnd w:id="121"/>
+    <w:bookmarkStart w:id="123" w:name="ref-revatr40"/>
     <w:p>
       <w:pPr>
         <w:pStyle w:val="Bibliography"/>
@@ -4175,6 +5504,75 @@
         <w:jc w:val="left"/>
       </w:pPr>
       <w:r>
+        <w:t xml:space="preserve">Mai, L., &amp; Carson-Berndsen, J. (2024).</w:t>
+      </w:r>
+      <w:r>
+        <w:t xml:space="preserve"> </w:t>
+      </w:r>
+      <w:r>
+        <w:rPr>
+          <w:i/>
+          <w:iCs/>
+        </w:rPr>
+        <w:t xml:space="preserve">Improving linguistic diversity of large language models with possibility exploration fine-tuning</w:t>
+      </w:r>
+      <w:r>
+        <w:t xml:space="preserve">. arXiv preprint.</w:t>
+      </w:r>
+      <w:r>
+        <w:t xml:space="preserve"> </w:t>
+      </w:r>
+      <w:hyperlink r:id="rId122">
+        <w:r>
+          <w:rPr>
+            <w:rStyle w:val="Hyperlink"/>
+          </w:rPr>
+          <w:t xml:space="preserve">https://doi.org/10.48550/ARXIV.2412.03343</w:t>
+        </w:r>
+      </w:hyperlink>
+    </w:p>
+    <w:bookmarkEnd w:id="123"/>
+    <w:bookmarkStart w:id="124" w:name="ref-mateas2003"/>
+    <w:p>
+      <w:pPr>
+        <w:pStyle w:val="Bibliography"/>
+        <w:spacing w:line="480" w:lineRule="auto" w:after="0"/>
+        <w:ind w:left="709" w:hanging="709"/>
+        <w:jc w:val="left"/>
+      </w:pPr>
+      <w:r>
+        <w:t xml:space="preserve">Mateas, M., &amp; Stern, A. (2003). Fa</w:t>
+      </w:r>
+      <w:r>
+        <w:t xml:space="preserve">ç</w:t>
+      </w:r>
+      <w:r>
+        <w:t xml:space="preserve">ade: An experiment in building a fully-realized interactive drama.</w:t>
+      </w:r>
+      <w:r>
+        <w:t xml:space="preserve"> </w:t>
+      </w:r>
+      <w:r>
+        <w:rPr>
+          <w:i/>
+          <w:iCs/>
+        </w:rPr>
+        <w:t xml:space="preserve">Game Developers Conference, Game Design Track</w:t>
+      </w:r>
+      <w:r>
+        <w:t xml:space="preserve">.</w:t>
+      </w:r>
+    </w:p>
+    <w:bookmarkEnd w:id="124"/>
+    <w:bookmarkStart w:id="126" w:name="ref-montola2008"/>
+    <w:p>
+      <w:pPr>
+        <w:pStyle w:val="Bibliography"/>
+        <w:spacing w:line="480" w:lineRule="auto" w:after="0"/>
+        <w:ind w:left="709" w:hanging="709"/>
+        <w:jc w:val="left"/>
+      </w:pPr>
+      <w:r>
         <w:t xml:space="preserve">Montola, M. (2008). The invisible rules of role-playing: The social framework of role-playing process.</w:t>
       </w:r>
       <w:r>
@@ -4193,7 +5591,7 @@
       <w:r>
         <w:t xml:space="preserve"> </w:t>
       </w:r>
-      <w:hyperlink r:id="rId85">
+      <w:hyperlink r:id="rId125">
         <w:r>
           <w:rPr>
             <w:rStyle w:val="Hyperlink"/>
@@ -4202,8 +5600,8 @@
         </w:r>
       </w:hyperlink>
     </w:p>
-    <w:bookmarkEnd w:id="86"/>
-    <w:bookmarkStart w:id="88" w:name="ref-newman2018"/>
+    <w:bookmarkEnd w:id="126"/>
+    <w:bookmarkStart w:id="128" w:name="ref-newman2018"/>
     <w:p>
       <w:pPr>
         <w:pStyle w:val="Bibliography"/>
@@ -4233,7 +5631,7 @@
       <w:r>
         <w:t xml:space="preserve"> </w:t>
       </w:r>
-      <w:hyperlink r:id="rId87">
+      <w:hyperlink r:id="rId127">
         <w:r>
           <w:rPr>
             <w:rStyle w:val="Hyperlink"/>
@@ -4242,8 +5640,8 @@
         </w:r>
       </w:hyperlink>
     </w:p>
-    <w:bookmarkEnd w:id="88"/>
-    <w:bookmarkStart w:id="90" w:name="ref-nosek2018"/>
+    <w:bookmarkEnd w:id="128"/>
+    <w:bookmarkStart w:id="130" w:name="ref-nosek2018"/>
     <w:p>
       <w:pPr>
         <w:pStyle w:val="Bibliography"/>
@@ -4283,7 +5681,7 @@
       <w:r>
         <w:t xml:space="preserve"> </w:t>
       </w:r>
-      <w:hyperlink r:id="rId89">
+      <w:hyperlink r:id="rId129">
         <w:r>
           <w:rPr>
             <w:rStyle w:val="Hyperlink"/>
@@ -4292,8 +5690,8 @@
         </w:r>
       </w:hyperlink>
     </w:p>
-    <w:bookmarkEnd w:id="90"/>
-    <w:bookmarkStart w:id="92" w:name="ref-padmakumar2024"/>
+    <w:bookmarkEnd w:id="130"/>
+    <w:bookmarkStart w:id="132" w:name="ref-padmakumar2024"/>
     <w:p>
       <w:pPr>
         <w:pStyle w:val="Bibliography"/>
@@ -4320,7 +5718,7 @@
       <w:r>
         <w:t xml:space="preserve"> </w:t>
       </w:r>
-      <w:hyperlink r:id="rId91">
+      <w:hyperlink r:id="rId131">
         <w:r>
           <w:rPr>
             <w:rStyle w:val="Hyperlink"/>
@@ -4329,8 +5727,8 @@
         </w:r>
       </w:hyperlink>
     </w:p>
-    <w:bookmarkEnd w:id="92"/>
-    <w:bookmarkStart w:id="94" w:name="ref-park2023"/>
+    <w:bookmarkEnd w:id="132"/>
+    <w:bookmarkStart w:id="134" w:name="ref-park2023"/>
     <w:p>
       <w:pPr>
         <w:pStyle w:val="Bibliography"/>
@@ -4357,7 +5755,7 @@
       <w:r>
         <w:t xml:space="preserve"> </w:t>
       </w:r>
-      <w:hyperlink r:id="rId93">
+      <w:hyperlink r:id="rId133">
         <w:r>
           <w:rPr>
             <w:rStyle w:val="Hyperlink"/>
@@ -4366,8 +5764,8 @@
         </w:r>
       </w:hyperlink>
     </w:p>
-    <w:bookmarkEnd w:id="94"/>
-    <w:bookmarkStart w:id="96" w:name="ref-riedl2013"/>
+    <w:bookmarkEnd w:id="134"/>
+    <w:bookmarkStart w:id="136" w:name="ref-revatr23"/>
     <w:p>
       <w:pPr>
         <w:pStyle w:val="Bibliography"/>
@@ -4376,6 +5774,52 @@
         <w:jc w:val="left"/>
       </w:pPr>
       <w:r>
+        <w:t xml:space="preserve">Ran, Y., Wang, X., Qiu, T., Liang, J., Xiao, Y., &amp; Yang, D. (2025).</w:t>
+      </w:r>
+      <w:r>
+        <w:t xml:space="preserve"> </w:t>
+      </w:r>
+      <w:r>
+        <w:t xml:space="preserve">BOOKWORLD</w:t>
+      </w:r>
+      <w:r>
+        <w:t xml:space="preserve">: From novels to interactive agent societies for story creation.</w:t>
+      </w:r>
+      <w:r>
+        <w:t xml:space="preserve"> </w:t>
+      </w:r>
+      <w:r>
+        <w:rPr>
+          <w:i/>
+          <w:iCs/>
+        </w:rPr>
+        <w:t xml:space="preserve">Proceedings of the 63rd Annual Meeting of the Association for Computational Linguistics (Volume 1: Long Papers)</w:t>
+      </w:r>
+      <w:r>
+        <w:t xml:space="preserve">, 15898–15912.</w:t>
+      </w:r>
+      <w:r>
+        <w:t xml:space="preserve"> </w:t>
+      </w:r>
+      <w:hyperlink r:id="rId135">
+        <w:r>
+          <w:rPr>
+            <w:rStyle w:val="Hyperlink"/>
+          </w:rPr>
+          <w:t xml:space="preserve">https://doi.org/10.18653/v1/2025.acl-long.773</w:t>
+        </w:r>
+      </w:hyperlink>
+    </w:p>
+    <w:bookmarkEnd w:id="136"/>
+    <w:bookmarkStart w:id="138" w:name="ref-riedl2013"/>
+    <w:p>
+      <w:pPr>
+        <w:pStyle w:val="Bibliography"/>
+        <w:spacing w:line="480" w:lineRule="auto" w:after="0"/>
+        <w:ind w:left="709" w:hanging="709"/>
+        <w:jc w:val="left"/>
+      </w:pPr>
+      <w:r>
         <w:t xml:space="preserve">Riedl, M. O., &amp; Bulitko, V. (2013). Interactive narrative: An intelligent systems approach.</w:t>
       </w:r>
       <w:r>
@@ -4407,7 +5851,7 @@
       <w:r>
         <w:t xml:space="preserve"> </w:t>
       </w:r>
-      <w:hyperlink r:id="rId95">
+      <w:hyperlink r:id="rId137">
         <w:r>
           <w:rPr>
             <w:rStyle w:val="Hyperlink"/>
@@ -4416,8 +5860,8 @@
         </w:r>
       </w:hyperlink>
     </w:p>
-    <w:bookmarkEnd w:id="96"/>
-    <w:bookmarkStart w:id="98" w:name="ref-riedl2010"/>
+    <w:bookmarkEnd w:id="138"/>
+    <w:bookmarkStart w:id="140" w:name="ref-riedl2010"/>
     <w:p>
       <w:pPr>
         <w:pStyle w:val="Bibliography"/>
@@ -4457,7 +5901,7 @@
       <w:r>
         <w:t xml:space="preserve"> </w:t>
       </w:r>
-      <w:hyperlink r:id="rId97">
+      <w:hyperlink r:id="rId139">
         <w:r>
           <w:rPr>
             <w:rStyle w:val="Hyperlink"/>
@@ -4466,8 +5910,8 @@
         </w:r>
       </w:hyperlink>
     </w:p>
-    <w:bookmarkEnd w:id="98"/>
-    <w:bookmarkStart w:id="99" w:name="ref-ryan2018"/>
+    <w:bookmarkEnd w:id="140"/>
+    <w:bookmarkStart w:id="141" w:name="ref-ryan2018"/>
     <w:p>
       <w:pPr>
         <w:pStyle w:val="Bibliography"/>
@@ -4495,8 +5939,8 @@
         <w:t xml:space="preserve">[PhD thesis]. University of California, Santa Cruz.</w:t>
       </w:r>
     </w:p>
-    <w:bookmarkEnd w:id="99"/>
-    <w:bookmarkStart w:id="100" w:name="ref-salen2004"/>
+    <w:bookmarkEnd w:id="141"/>
+    <w:bookmarkStart w:id="142" w:name="ref-salen2004"/>
     <w:p>
       <w:pPr>
         <w:pStyle w:val="Bibliography"/>
@@ -4521,8 +5965,8 @@
         <w:t xml:space="preserve">. MIT Press.</w:t>
       </w:r>
     </w:p>
-    <w:bookmarkEnd w:id="100"/>
-    <w:bookmarkStart w:id="101" w:name="ref-strogatz2015"/>
+    <w:bookmarkEnd w:id="142"/>
+    <w:bookmarkStart w:id="144" w:name="ref-revatr32"/>
     <w:p>
       <w:pPr>
         <w:pStyle w:val="Bibliography"/>
@@ -4531,27 +5975,35 @@
         <w:jc w:val="left"/>
       </w:pPr>
       <w:r>
-        <w:t xml:space="preserve">Strogatz, S. H. (2015).</w:t>
-      </w:r>
-      <w:r>
-        <w:t xml:space="preserve"> </w:t>
-      </w:r>
-      <w:r>
-        <w:rPr>
-          <w:i/>
-          <w:iCs/>
-        </w:rPr>
-        <w:t xml:space="preserve">Nonlinear dynamics and chaos: With applications to physics, biology, chemistry, and engineering</w:t>
-      </w:r>
-      <w:r>
-        <w:t xml:space="preserve"> </w:t>
-      </w:r>
-      <w:r>
-        <w:t xml:space="preserve">(2nd ed.). Westview Press.</w:t>
-      </w:r>
-    </w:p>
-    <w:bookmarkEnd w:id="101"/>
-    <w:bookmarkStart w:id="103" w:name="ref-tian2024"/>
+        <w:t xml:space="preserve">Shi, G., Huang, K., &amp; Feng, G. (2025).</w:t>
+      </w:r>
+      <w:r>
+        <w:t xml:space="preserve"> </w:t>
+      </w:r>
+      <w:r>
+        <w:rPr>
+          <w:i/>
+          <w:iCs/>
+        </w:rPr>
+        <w:t xml:space="preserve">Long story generation via knowledge graph and literary theory</w:t>
+      </w:r>
+      <w:r>
+        <w:t xml:space="preserve">. arXiv preprint.</w:t>
+      </w:r>
+      <w:r>
+        <w:t xml:space="preserve"> </w:t>
+      </w:r>
+      <w:hyperlink r:id="rId143">
+        <w:r>
+          <w:rPr>
+            <w:rStyle w:val="Hyperlink"/>
+          </w:rPr>
+          <w:t xml:space="preserve">https://doi.org/10.48550/ARXIV.2508.03137</w:t>
+        </w:r>
+      </w:hyperlink>
+    </w:p>
+    <w:bookmarkEnd w:id="144"/>
+    <w:bookmarkStart w:id="146" w:name="ref-revatr01"/>
     <w:p>
       <w:pPr>
         <w:pStyle w:val="Bibliography"/>
@@ -4560,6 +6012,225 @@
         <w:jc w:val="left"/>
       </w:pPr>
       <w:r>
+        <w:t xml:space="preserve">Sillano, A., Arbore, G., &amp; De Russis, L. (2026). A persona-augmented multi-agent system for varied narrative generation.</w:t>
+      </w:r>
+      <w:r>
+        <w:t xml:space="preserve"> </w:t>
+      </w:r>
+      <w:r>
+        <w:rPr>
+          <w:i/>
+          <w:iCs/>
+        </w:rPr>
+        <w:t xml:space="preserve">Companion Proceedings of the 18th ACM SIGCHI Symposium on Engineering Interactive Computing Systems</w:t>
+      </w:r>
+      <w:r>
+        <w:t xml:space="preserve">, 32–39.</w:t>
+      </w:r>
+      <w:r>
+        <w:t xml:space="preserve"> </w:t>
+      </w:r>
+      <w:hyperlink r:id="rId145">
+        <w:r>
+          <w:rPr>
+            <w:rStyle w:val="Hyperlink"/>
+          </w:rPr>
+          <w:t xml:space="preserve">https://doi.org/10.1145/3807968.3810931</w:t>
+        </w:r>
+      </w:hyperlink>
+    </w:p>
+    <w:bookmarkEnd w:id="146"/>
+    <w:bookmarkStart w:id="148" w:name="ref-revatr20"/>
+    <w:p>
+      <w:pPr>
+        <w:pStyle w:val="Bibliography"/>
+        <w:spacing w:line="480" w:lineRule="auto" w:after="0"/>
+        <w:ind w:left="709" w:hanging="709"/>
+        <w:jc w:val="left"/>
+      </w:pPr>
+      <w:r>
+        <w:t xml:space="preserve">Singh Rathore, P. (2026).</w:t>
+      </w:r>
+      <w:r>
+        <w:t xml:space="preserve"> </w:t>
+      </w:r>
+      <w:r>
+        <w:rPr>
+          <w:i/>
+          <w:iCs/>
+        </w:rPr>
+        <w:t xml:space="preserve">Which india survives translation? Narrative homogenisation across indian oral traditions in</w:t>
+      </w:r>
+      <w:r>
+        <w:rPr>
+          <w:i/>
+          <w:iCs/>
+        </w:rPr>
+        <w:t xml:space="preserve"> </w:t>
+      </w:r>
+      <w:r>
+        <w:rPr>
+          <w:i/>
+          <w:iCs/>
+        </w:rPr>
+        <w:t xml:space="preserve">LLMs</w:t>
+      </w:r>
+      <w:r>
+        <w:t xml:space="preserve">.</w:t>
+      </w:r>
+      <w:r>
+        <w:t xml:space="preserve"> </w:t>
+      </w:r>
+      <w:hyperlink r:id="rId147">
+        <w:r>
+          <w:rPr>
+            <w:rStyle w:val="Hyperlink"/>
+          </w:rPr>
+          <w:t xml:space="preserve">https://doi.org/10.2139/ssrn.7133858</w:t>
+        </w:r>
+      </w:hyperlink>
+    </w:p>
+    <w:bookmarkEnd w:id="148"/>
+    <w:bookmarkStart w:id="150" w:name="ref-revatr43"/>
+    <w:p>
+      <w:pPr>
+        <w:pStyle w:val="Bibliography"/>
+        <w:spacing w:line="480" w:lineRule="auto" w:after="0"/>
+        <w:ind w:left="709" w:hanging="709"/>
+        <w:jc w:val="left"/>
+      </w:pPr>
+      <w:r>
+        <w:t xml:space="preserve">Song, J., Zhu, A., &amp; Callison-Burch, C. (2024).</w:t>
+      </w:r>
+      <w:r>
+        <w:t xml:space="preserve"> </w:t>
+      </w:r>
+      <w:r>
+        <w:rPr>
+          <w:i/>
+          <w:iCs/>
+        </w:rPr>
+        <w:t xml:space="preserve">You have thirteen hours in which to solve the labyrinth: Enhancing</w:t>
+      </w:r>
+      <w:r>
+        <w:rPr>
+          <w:i/>
+          <w:iCs/>
+        </w:rPr>
+        <w:t xml:space="preserve"> </w:t>
+      </w:r>
+      <w:r>
+        <w:rPr>
+          <w:i/>
+          <w:iCs/>
+        </w:rPr>
+        <w:t xml:space="preserve">AI</w:t>
+      </w:r>
+      <w:r>
+        <w:rPr>
+          <w:i/>
+          <w:iCs/>
+        </w:rPr>
+        <w:t xml:space="preserve"> </w:t>
+      </w:r>
+      <w:r>
+        <w:rPr>
+          <w:i/>
+          <w:iCs/>
+        </w:rPr>
+        <w:t xml:space="preserve">game masters with function calling</w:t>
+      </w:r>
+      <w:r>
+        <w:t xml:space="preserve">. arXiv preprint.</w:t>
+      </w:r>
+      <w:r>
+        <w:t xml:space="preserve"> </w:t>
+      </w:r>
+      <w:hyperlink r:id="rId149">
+        <w:r>
+          <w:rPr>
+            <w:rStyle w:val="Hyperlink"/>
+          </w:rPr>
+          <w:t xml:space="preserve">https://doi.org/10.48550/ARXIV.2409.06949</w:t>
+        </w:r>
+      </w:hyperlink>
+    </w:p>
+    <w:bookmarkEnd w:id="150"/>
+    <w:bookmarkStart w:id="151" w:name="ref-strogatz2015"/>
+    <w:p>
+      <w:pPr>
+        <w:pStyle w:val="Bibliography"/>
+        <w:spacing w:line="480" w:lineRule="auto" w:after="0"/>
+        <w:ind w:left="709" w:hanging="709"/>
+        <w:jc w:val="left"/>
+      </w:pPr>
+      <w:r>
+        <w:t xml:space="preserve">Strogatz, S. H. (2015).</w:t>
+      </w:r>
+      <w:r>
+        <w:t xml:space="preserve"> </w:t>
+      </w:r>
+      <w:r>
+        <w:rPr>
+          <w:i/>
+          <w:iCs/>
+        </w:rPr>
+        <w:t xml:space="preserve">Nonlinear dynamics and chaos: With applications to physics, biology, chemistry, and engineering</w:t>
+      </w:r>
+      <w:r>
+        <w:t xml:space="preserve"> </w:t>
+      </w:r>
+      <w:r>
+        <w:t xml:space="preserve">(2nd ed.). Westview Press.</w:t>
+      </w:r>
+    </w:p>
+    <w:bookmarkEnd w:id="151"/>
+    <w:bookmarkStart w:id="153" w:name="ref-revatr17"/>
+    <w:p>
+      <w:pPr>
+        <w:pStyle w:val="Bibliography"/>
+        <w:spacing w:line="480" w:lineRule="auto" w:after="0"/>
+        <w:ind w:left="709" w:hanging="709"/>
+        <w:jc w:val="left"/>
+      </w:pPr>
+      <w:r>
+        <w:t xml:space="preserve">Tang, X., Zhang, J., Yang, Z., Tang, Y., Li, S., Lai, L., &amp; Yang, Z. (2026).</w:t>
+      </w:r>
+      <w:r>
+        <w:t xml:space="preserve"> </w:t>
+      </w:r>
+      <w:r>
+        <w:rPr>
+          <w:i/>
+          <w:iCs/>
+        </w:rPr>
+        <w:t xml:space="preserve">Staying in character: Perspective-bounded memory for book-based role-playing agents</w:t>
+      </w:r>
+      <w:r>
+        <w:t xml:space="preserve">. arXiv preprint.</w:t>
+      </w:r>
+      <w:r>
+        <w:t xml:space="preserve"> </w:t>
+      </w:r>
+      <w:hyperlink r:id="rId152">
+        <w:r>
+          <w:rPr>
+            <w:rStyle w:val="Hyperlink"/>
+          </w:rPr>
+          <w:t xml:space="preserve">https://doi.org/10.48550/ARXIV.2606.25632</w:t>
+        </w:r>
+      </w:hyperlink>
+    </w:p>
+    <w:bookmarkEnd w:id="153"/>
+    <w:bookmarkStart w:id="155" w:name="ref-tian2024"/>
+    <w:p>
+      <w:pPr>
+        <w:pStyle w:val="Bibliography"/>
+        <w:spacing w:line="480" w:lineRule="auto" w:after="0"/>
+        <w:ind w:left="709" w:hanging="709"/>
+        <w:jc w:val="left"/>
+      </w:pPr>
+      <w:r>
         <w:t xml:space="preserve">Tian, Y., Huang, T., Liu, M., Jiang, D., Spangher, A., Chen, M., May, J., &amp; Peng, N. (2024). Are large language models capable of generating human-level narratives?</w:t>
       </w:r>
       <w:r>
@@ -4578,7 +6249,7 @@
       <w:r>
         <w:t xml:space="preserve"> </w:t>
       </w:r>
-      <w:hyperlink r:id="rId102">
+      <w:hyperlink r:id="rId154">
         <w:r>
           <w:rPr>
             <w:rStyle w:val="Hyperlink"/>
@@ -4587,8 +6258,8 @@
         </w:r>
       </w:hyperlink>
     </w:p>
-    <w:bookmarkEnd w:id="103"/>
-    <w:bookmarkStart w:id="105" w:name="ref-trabasso1985"/>
+    <w:bookmarkEnd w:id="155"/>
+    <w:bookmarkStart w:id="157" w:name="ref-trabasso1985"/>
     <w:p>
       <w:pPr>
         <w:pStyle w:val="Bibliography"/>
@@ -4628,7 +6299,7 @@
       <w:r>
         <w:t xml:space="preserve"> </w:t>
       </w:r>
-      <w:hyperlink r:id="rId104">
+      <w:hyperlink r:id="rId156">
         <w:r>
           <w:rPr>
             <w:rStyle w:val="Hyperlink"/>
@@ -4637,8 +6308,8 @@
         </w:r>
       </w:hyperlink>
     </w:p>
-    <w:bookmarkEnd w:id="105"/>
-    <w:bookmarkStart w:id="107" w:name="ref-unesco2024"/>
+    <w:bookmarkEnd w:id="157"/>
+    <w:bookmarkStart w:id="159" w:name="ref-unesco2024"/>
     <w:p>
       <w:pPr>
         <w:pStyle w:val="Bibliography"/>
@@ -4679,7 +6350,7 @@
       <w:r>
         <w:t xml:space="preserve"> </w:t>
       </w:r>
-      <w:hyperlink r:id="rId106">
+      <w:hyperlink r:id="rId158">
         <w:r>
           <w:rPr>
             <w:rStyle w:val="Hyperlink"/>
@@ -4688,8 +6359,8 @@
         </w:r>
       </w:hyperlink>
     </w:p>
-    <w:bookmarkEnd w:id="107"/>
-    <w:bookmarkStart w:id="109" w:name="ref-xu2025"/>
+    <w:bookmarkEnd w:id="159"/>
+    <w:bookmarkStart w:id="161" w:name="ref-revatr36"/>
     <w:p>
       <w:pPr>
         <w:pStyle w:val="Bibliography"/>
@@ -4698,6 +6369,43 @@
         <w:jc w:val="left"/>
       </w:pPr>
       <w:r>
+        <w:t xml:space="preserve">Xia, H., Peng, H., Qi, Y., Xu, B., Li, J., Lei, H., &amp; Wang, X. (2025). &lt;Scp&gt;StoryWriter:&lt;/scp&gt; a multi-agent framework for long story generation.</w:t>
+      </w:r>
+      <w:r>
+        <w:t xml:space="preserve"> </w:t>
+      </w:r>
+      <w:r>
+        <w:rPr>
+          <w:i/>
+          <w:iCs/>
+        </w:rPr>
+        <w:t xml:space="preserve">Proceedings of the 34th ACM International Conference on Information and Knowledge Management</w:t>
+      </w:r>
+      <w:r>
+        <w:t xml:space="preserve">, 6559–6563.</w:t>
+      </w:r>
+      <w:r>
+        <w:t xml:space="preserve"> </w:t>
+      </w:r>
+      <w:hyperlink r:id="rId160">
+        <w:r>
+          <w:rPr>
+            <w:rStyle w:val="Hyperlink"/>
+          </w:rPr>
+          <w:t xml:space="preserve">https://doi.org/10.1145/3746252.3761616</w:t>
+        </w:r>
+      </w:hyperlink>
+    </w:p>
+    <w:bookmarkEnd w:id="161"/>
+    <w:bookmarkStart w:id="163" w:name="ref-xu2025"/>
+    <w:p>
+      <w:pPr>
+        <w:pStyle w:val="Bibliography"/>
+        <w:spacing w:line="480" w:lineRule="auto" w:after="0"/>
+        <w:ind w:left="709" w:hanging="709"/>
+        <w:jc w:val="left"/>
+      </w:pPr>
+      <w:r>
         <w:t xml:space="preserve">Xu, W., Jojic, N., Rao, S., Brockett, C., &amp; Dolan, B. (2025). Echoes in</w:t>
       </w:r>
       <w:r>
@@ -4750,7 +6458,7 @@
       <w:r>
         <w:t xml:space="preserve"> </w:t>
       </w:r>
-      <w:hyperlink r:id="rId108">
+      <w:hyperlink r:id="rId162">
         <w:r>
           <w:rPr>
             <w:rStyle w:val="Hyperlink"/>
@@ -4759,9 +6467,90 @@
         </w:r>
       </w:hyperlink>
     </w:p>
-    <w:bookmarkEnd w:id="109"/>
-    <w:bookmarkEnd w:id="110"/>
-    <w:bookmarkEnd w:id="111"/>
+    <w:bookmarkEnd w:id="163"/>
+    <w:bookmarkStart w:id="165" w:name="ref-revatr35"/>
+    <w:p>
+      <w:pPr>
+        <w:pStyle w:val="Bibliography"/>
+        <w:spacing w:line="480" w:lineRule="auto" w:after="0"/>
+        <w:ind w:left="709" w:hanging="709"/>
+        <w:jc w:val="left"/>
+      </w:pPr>
+      <w:r>
+        <w:t xml:space="preserve">Yu, P., Shen, D., Meng, S., Lee, J., Yin, W., Cui, A. Y., Xu, Z., Zhu, Y., Shi, X., Li, M., &amp; Smola, A. (2025).</w:t>
+      </w:r>
+      <w:r>
+        <w:t xml:space="preserve"> </w:t>
+      </w:r>
+      <w:r>
+        <w:rPr>
+          <w:i/>
+          <w:iCs/>
+        </w:rPr>
+        <w:t xml:space="preserve">RPGBENCH</w:t>
+      </w:r>
+      <w:r>
+        <w:rPr>
+          <w:i/>
+          <w:iCs/>
+        </w:rPr>
+        <w:t xml:space="preserve">: Evaluating large language models as role-playing game engines</w:t>
+      </w:r>
+      <w:r>
+        <w:t xml:space="preserve">. arXiv preprint.</w:t>
+      </w:r>
+      <w:r>
+        <w:t xml:space="preserve"> </w:t>
+      </w:r>
+      <w:hyperlink r:id="rId164">
+        <w:r>
+          <w:rPr>
+            <w:rStyle w:val="Hyperlink"/>
+          </w:rPr>
+          <w:t xml:space="preserve">https://doi.org/10.48550/ARXIV.2502.00595</w:t>
+        </w:r>
+      </w:hyperlink>
+    </w:p>
+    <w:bookmarkEnd w:id="165"/>
+    <w:bookmarkStart w:id="167" w:name="ref-revatr44"/>
+    <w:p>
+      <w:pPr>
+        <w:pStyle w:val="Bibliography"/>
+        <w:spacing w:line="480" w:lineRule="auto" w:after="0"/>
+        <w:ind w:left="709" w:hanging="709"/>
+        <w:jc w:val="left"/>
+      </w:pPr>
+      <w:r>
+        <w:t xml:space="preserve">Zhao, R., Zhang, W., Li, J., Zhu, L., Li, Y., He, Y., &amp; Gui, L. (2023).</w:t>
+      </w:r>
+      <w:r>
+        <w:t xml:space="preserve"> </w:t>
+      </w:r>
+      <w:r>
+        <w:rPr>
+          <w:i/>
+          <w:iCs/>
+        </w:rPr>
+        <w:t xml:space="preserve">NarrativePlay: Interactive narrative understanding</w:t>
+      </w:r>
+      <w:r>
+        <w:t xml:space="preserve">. arXiv preprint.</w:t>
+      </w:r>
+      <w:r>
+        <w:t xml:space="preserve"> </w:t>
+      </w:r>
+      <w:hyperlink r:id="rId166">
+        <w:r>
+          <w:rPr>
+            <w:rStyle w:val="Hyperlink"/>
+          </w:rPr>
+          <w:t xml:space="preserve">https://doi.org/10.48550/ARXIV.2310.01459</w:t>
+        </w:r>
+      </w:hyperlink>
+    </w:p>
+    <w:bookmarkEnd w:id="167"/>
+    <w:bookmarkEnd w:id="168"/>
+    <w:bookmarkEnd w:id="169"/>
     <w:sectPr>
       <w:headerReference w:type="default" r:id="rId9"/>
       <w:pgSz w:w="11906" w:h="16838"/>

</xml_diff>